<commit_message>
Update sales agent, tests, and documentation
</commit_message>
<xml_diff>
--- a/per_scholas_template.docx
+++ b/per_scholas_template.docx
@@ -1,106 +1,82 @@
 
 <file path=word/document.xml><?xml version="1.0" encoding="utf-8"?>
-<w:document xmlns:mc="http://schemas.openxmlformats.org/markup-compatibility/2006" xmlns:o="urn:schemas-microsoft-com:office:office" xmlns:r="http://schemas.openxmlformats.org/officeDocument/2006/relationships" xmlns:m="http://schemas.openxmlformats.org/officeDocument/2006/math" xmlns:v="urn:schemas-microsoft-com:vml" xmlns:wp="http://schemas.openxmlformats.org/drawingml/2006/wordprocessingDrawing" xmlns:w10="urn:schemas-microsoft-com:office:word" xmlns:w="http://schemas.openxmlformats.org/wordprocessingml/2006/main" xmlns:wne="http://schemas.microsoft.com/office/word/2006/wordml" xmlns:sl="http://schemas.openxmlformats.org/schemaLibrary/2006/main" xmlns:a="http://schemas.openxmlformats.org/drawingml/2006/main" xmlns:pic="http://schemas.openxmlformats.org/drawingml/2006/picture" xmlns:c="http://schemas.openxmlformats.org/drawingml/2006/chart" xmlns:lc="http://schemas.openxmlformats.org/drawingml/2006/lockedCanvas" xmlns:dgm="http://schemas.openxmlformats.org/drawingml/2006/diagram" xmlns:wps="http://schemas.microsoft.com/office/word/2010/wordprocessingShape" xmlns:wpg="http://schemas.microsoft.com/office/word/2010/wordprocessingGroup" xmlns:w14="http://schemas.microsoft.com/office/word/2010/wordml" xmlns:w15="http://schemas.microsoft.com/office/word/2012/wordml" xmlns:w16="http://schemas.microsoft.com/office/word/2018/wordml" xmlns:w16cex="http://schemas.microsoft.com/office/word/2018/wordml/cex" xmlns:w16cid="http://schemas.microsoft.com/office/word/2016/wordml/cid" xmlns="http://schemas.microsoft.com/office/tasks/2019/documenttasks" xmlns:cr="http://schemas.microsoft.com/office/comments/2020/reactions">
+<w:document xmlns:wpc="http://schemas.microsoft.com/office/word/2010/wordprocessingCanvas" xmlns:cx="http://schemas.microsoft.com/office/drawing/2014/chartex" xmlns:cx1="http://schemas.microsoft.com/office/drawing/2015/9/8/chartex" xmlns:cx2="http://schemas.microsoft.com/office/drawing/2015/10/21/chartex" xmlns:cx3="http://schemas.microsoft.com/office/drawing/2016/5/9/chartex" xmlns:cx4="http://schemas.microsoft.com/office/drawing/2016/5/10/chartex" xmlns:cx5="http://schemas.microsoft.com/office/drawing/2016/5/11/chartex" xmlns:cx6="http://schemas.microsoft.com/office/drawing/2016/5/12/chartex" xmlns:cx7="http://schemas.microsoft.com/office/drawing/2016/5/13/chartex" xmlns:cx8="http://schemas.microsoft.com/office/drawing/2016/5/14/chartex" xmlns:mc="http://schemas.openxmlformats.org/markup-compatibility/2006" xmlns:aink="http://schemas.microsoft.com/office/drawing/2016/ink" xmlns:am3d="http://schemas.microsoft.com/office/drawing/2017/model3d" xmlns:o="urn:schemas-microsoft-com:office:office" xmlns:oel="http://schemas.microsoft.com/office/2019/extlst" xmlns:r="http://schemas.openxmlformats.org/officeDocument/2006/relationships" xmlns:m="http://schemas.openxmlformats.org/officeDocument/2006/math" xmlns:v="urn:schemas-microsoft-com:vml" xmlns:wp14="http://schemas.microsoft.com/office/word/2010/wordprocessingDrawing" xmlns:wp="http://schemas.openxmlformats.org/drawingml/2006/wordprocessingDrawing" xmlns:w10="urn:schemas-microsoft-com:office:word" xmlns:w="http://schemas.openxmlformats.org/wordprocessingml/2006/main" xmlns:w14="http://schemas.microsoft.com/office/word/2010/wordml" xmlns:w15="http://schemas.microsoft.com/office/word/2012/wordml" xmlns:w16cex="http://schemas.microsoft.com/office/word/2018/wordml/cex" xmlns:w16cid="http://schemas.microsoft.com/office/word/2016/wordml/cid" xmlns:w16="http://schemas.microsoft.com/office/word/2018/wordml" xmlns:w16du="http://schemas.microsoft.com/office/word/2023/wordml/word16du" xmlns:w16sdtdh="http://schemas.microsoft.com/office/word/2020/wordml/sdtdatahash" xmlns:w16sdtfl="http://schemas.microsoft.com/office/word/2024/wordml/sdtformatlock" xmlns:w16se="http://schemas.microsoft.com/office/word/2015/wordml/symex" xmlns:wpg="http://schemas.microsoft.com/office/word/2010/wordprocessingGroup" xmlns:wpi="http://schemas.microsoft.com/office/word/2010/wordprocessingInk" xmlns:wne="http://schemas.microsoft.com/office/word/2006/wordml" xmlns:wps="http://schemas.microsoft.com/office/word/2010/wordprocessingShape" mc:Ignorable="w14 w15 w16se w16cid w16 w16cex w16sdtdh w16sdtfl w16du wp14">
   <w:body>
     <w:p>
       <w:pPr>
         <w:pStyle w:val="Heading1"/>
-        <w:rPr/>
-      </w:pPr>
-      <w:bookmarkStart w:colFirst="0" w:colLast="0" w:name="_aczyuw2yex2w" w:id="0"/>
+      </w:pPr>
+      <w:bookmarkStart w:id="0" w:name="_aczyuw2yex2w" w:colFirst="0" w:colLast="0"/>
       <w:bookmarkEnd w:id="0"/>
       <w:r>
-        <w:rPr>
-          <w:rtl w:val="0"/>
-        </w:rPr>
-        <w:t xml:space="preserve">Report</w:t>
+        <w:t>Report</w:t>
       </w:r>
     </w:p>
     <w:p>
       <w:pPr>
         <w:pStyle w:val="Title"/>
-        <w:pageBreakBefore w:val="0"/>
         <w:pBdr>
-          <w:top w:space="0" w:sz="0" w:val="nil"/>
-          <w:left w:space="0" w:sz="0" w:val="nil"/>
-          <w:bottom w:space="0" w:sz="0" w:val="nil"/>
-          <w:right w:space="0" w:sz="0" w:val="nil"/>
-          <w:between w:space="0" w:sz="0" w:val="nil"/>
+          <w:top w:val="nil"/>
+          <w:left w:val="nil"/>
+          <w:bottom w:val="nil"/>
+          <w:right w:val="nil"/>
+          <w:between w:val="nil"/>
         </w:pBdr>
-        <w:shd w:fill="auto" w:val="clear"/>
         <w:rPr>
-          <w:rFonts w:ascii="Helvetica Neue" w:cs="Helvetica Neue" w:eastAsia="Helvetica Neue" w:hAnsi="Helvetica Neue"/>
+          <w:rFonts w:ascii="Helvetica Neue" w:eastAsia="Helvetica Neue" w:hAnsi="Helvetica Neue" w:cs="Helvetica Neue"/>
           <w:color w:val="222428"/>
-          <w:sz w:val="96"/>
-          <w:szCs w:val="96"/>
         </w:rPr>
       </w:pPr>
-      <w:bookmarkStart w:colFirst="0" w:colLast="0" w:name="_77d93qv3ce1k" w:id="1"/>
+      <w:bookmarkStart w:id="1" w:name="_77d93qv3ce1k" w:colFirst="0" w:colLast="0"/>
       <w:bookmarkEnd w:id="1"/>
       <w:r>
         <w:rPr>
-          <w:rFonts w:ascii="Helvetica Neue" w:cs="Helvetica Neue" w:eastAsia="Helvetica Neue" w:hAnsi="Helvetica Neue"/>
+          <w:rFonts w:ascii="Helvetica Neue" w:eastAsia="Helvetica Neue" w:hAnsi="Helvetica Neue" w:cs="Helvetica Neue"/>
           <w:color w:val="222428"/>
-          <w:sz w:val="96"/>
-          <w:szCs w:val="96"/>
-          <w:rtl w:val="0"/>
         </w:rPr>
-        <w:t xml:space="preserve">[</w:t>
-      </w:r>
-      <w:r>
-        <w:rPr>
-          <w:rFonts w:ascii="Helvetica Neue" w:cs="Helvetica Neue" w:eastAsia="Helvetica Neue" w:hAnsi="Helvetica Neue"/>
-          <w:color w:val="222428"/>
-          <w:rtl w:val="0"/>
-        </w:rPr>
-        <w:t xml:space="preserve">Title]</w:t>
-      </w:r>
-      <w:r>
-        <w:rPr>
-          <w:rtl w:val="0"/>
-        </w:rPr>
+        <w:t>[Title]</w:t>
       </w:r>
     </w:p>
     <w:p>
       <w:pPr>
-        <w:pageBreakBefore w:val="0"/>
         <w:pBdr>
-          <w:top w:space="0" w:sz="0" w:val="nil"/>
-          <w:left w:space="0" w:sz="0" w:val="nil"/>
-          <w:bottom w:space="0" w:sz="0" w:val="nil"/>
-          <w:right w:space="0" w:sz="0" w:val="nil"/>
-          <w:between w:space="0" w:sz="0" w:val="nil"/>
+          <w:top w:val="nil"/>
+          <w:left w:val="nil"/>
+          <w:bottom w:val="nil"/>
+          <w:right w:val="nil"/>
+          <w:between w:val="nil"/>
         </w:pBdr>
-        <w:shd w:fill="auto" w:val="clear"/>
         <w:spacing w:after="3600" w:line="240" w:lineRule="auto"/>
         <w:rPr>
-          <w:rFonts w:ascii="Arial" w:cs="Arial" w:eastAsia="Arial" w:hAnsi="Arial"/>
+          <w:rFonts w:ascii="Arial" w:eastAsia="Arial" w:hAnsi="Arial" w:cs="Arial"/>
           <w:sz w:val="72"/>
           <w:szCs w:val="72"/>
         </w:rPr>
       </w:pPr>
       <w:r>
         <w:rPr>
-          <w:rFonts w:ascii="Arial" w:cs="Arial" w:eastAsia="Arial" w:hAnsi="Arial"/>
+          <w:rFonts w:ascii="Arial" w:eastAsia="Arial" w:hAnsi="Arial" w:cs="Arial"/>
+          <w:noProof/>
           <w:color w:val="666666"/>
           <w:sz w:val="20"/>
           <w:szCs w:val="20"/>
         </w:rPr>
         <w:drawing>
-          <wp:inline distB="0" distT="0" distL="0" distR="0">
+          <wp:inline distT="0" distB="0" distL="0" distR="0" wp14:anchorId="6910B5AF" wp14:editId="4116F4DC">
             <wp:extent cx="448056" cy="54864"/>
-            <wp:effectExtent b="0" l="0" r="0" t="0"/>
-            <wp:docPr descr="footer" id="8" name="image6.png"/>
-            <a:graphic>
+            <wp:effectExtent l="0" t="0" r="0" b="0"/>
+            <wp:docPr id="8" name="image6.png" descr="footer"/>
+            <wp:cNvGraphicFramePr/>
+            <a:graphic xmlns:a="http://schemas.openxmlformats.org/drawingml/2006/main">
               <a:graphicData uri="http://schemas.openxmlformats.org/drawingml/2006/picture">
-                <pic:pic>
+                <pic:pic xmlns:pic="http://schemas.openxmlformats.org/drawingml/2006/picture">
                   <pic:nvPicPr>
-                    <pic:cNvPr descr="footer" id="0" name="image6.png"/>
+                    <pic:cNvPr id="0" name="image6.png" descr="footer"/>
                     <pic:cNvPicPr preferRelativeResize="0"/>
                   </pic:nvPicPr>
                   <pic:blipFill>
-                    <a:blip r:embed="rId6"/>
-                    <a:srcRect b="1037" l="0" r="0" t="1037"/>
+                    <a:blip r:embed="rId7"/>
+                    <a:srcRect t="1037" b="1037"/>
                     <a:stretch>
                       <a:fillRect/>
                     </a:stretch>
@@ -110,7 +86,9 @@
                       <a:off x="0" y="0"/>
                       <a:ext cx="448056" cy="54864"/>
                     </a:xfrm>
-                    <a:prstGeom prst="rect"/>
+                    <a:prstGeom prst="rect">
+                      <a:avLst/>
+                    </a:prstGeom>
                     <a:ln/>
                   </pic:spPr>
                 </pic:pic>
@@ -119,25 +97,18 @@
           </wp:inline>
         </w:drawing>
       </w:r>
-      <w:r>
-        <w:rPr>
-          <w:rtl w:val="0"/>
-        </w:rPr>
-      </w:r>
     </w:p>
     <w:p>
       <w:pPr>
-        <w:pageBreakBefore w:val="0"/>
         <w:pBdr>
-          <w:top w:space="0" w:sz="0" w:val="nil"/>
-          <w:left w:space="0" w:sz="0" w:val="nil"/>
-          <w:bottom w:space="0" w:sz="0" w:val="nil"/>
-          <w:right w:space="0" w:sz="0" w:val="nil"/>
-          <w:between w:space="0" w:sz="0" w:val="nil"/>
+          <w:top w:val="nil"/>
+          <w:left w:val="nil"/>
+          <w:bottom w:val="nil"/>
+          <w:right w:val="nil"/>
+          <w:between w:val="nil"/>
         </w:pBdr>
-        <w:shd w:fill="auto" w:val="clear"/>
         <w:rPr>
-          <w:rFonts w:ascii="Helvetica Neue" w:cs="Helvetica Neue" w:eastAsia="Helvetica Neue" w:hAnsi="Helvetica Neue"/>
+          <w:rFonts w:ascii="Helvetica Neue" w:eastAsia="Helvetica Neue" w:hAnsi="Helvetica Neue" w:cs="Helvetica Neue"/>
           <w:color w:val="666666"/>
           <w:sz w:val="32"/>
           <w:szCs w:val="32"/>
@@ -145,63 +116,56 @@
       </w:pPr>
       <w:r>
         <w:rPr>
-          <w:rFonts w:ascii="Helvetica Neue" w:cs="Helvetica Neue" w:eastAsia="Helvetica Neue" w:hAnsi="Helvetica Neue"/>
+          <w:rFonts w:ascii="Helvetica Neue" w:eastAsia="Helvetica Neue" w:hAnsi="Helvetica Neue" w:cs="Helvetica Neue"/>
           <w:sz w:val="32"/>
           <w:szCs w:val="32"/>
-          <w:rtl w:val="0"/>
         </w:rPr>
-        <w:t xml:space="preserve">[Learner Name]</w:t>
-        <w:br w:type="textWrapping"/>
+        <w:t>[Learner Name]</w:t>
       </w:r>
       <w:r>
         <w:rPr>
-          <w:rFonts w:ascii="Helvetica Neue" w:cs="Helvetica Neue" w:eastAsia="Helvetica Neue" w:hAnsi="Helvetica Neue"/>
-          <w:color w:val="666666"/>
+          <w:rFonts w:ascii="Helvetica Neue" w:eastAsia="Helvetica Neue" w:hAnsi="Helvetica Neue" w:cs="Helvetica Neue"/>
           <w:sz w:val="32"/>
           <w:szCs w:val="32"/>
-          <w:rtl w:val="0"/>
         </w:rPr>
-        <w:t xml:space="preserve">[Date]</w:t>
-      </w:r>
-      <w:r>
-        <w:br w:type="page"/>
+        <w:br/>
       </w:r>
       <w:r>
         <w:rPr>
-          <w:rtl w:val="0"/>
-        </w:rPr>
-      </w:r>
-    </w:p>
-    <w:p>
-      <w:pPr>
-        <w:pageBreakBefore w:val="0"/>
-        <w:pBdr>
-          <w:top w:space="0" w:sz="0" w:val="nil"/>
-          <w:left w:space="0" w:sz="0" w:val="nil"/>
-          <w:bottom w:space="0" w:sz="0" w:val="nil"/>
-          <w:right w:space="0" w:sz="0" w:val="nil"/>
-          <w:between w:space="0" w:sz="0" w:val="nil"/>
-        </w:pBdr>
-        <w:shd w:fill="auto" w:val="clear"/>
-        <w:rPr>
-          <w:rFonts w:ascii="Helvetica Neue" w:cs="Helvetica Neue" w:eastAsia="Helvetica Neue" w:hAnsi="Helvetica Neue"/>
+          <w:rFonts w:ascii="Helvetica Neue" w:eastAsia="Helvetica Neue" w:hAnsi="Helvetica Neue" w:cs="Helvetica Neue"/>
           <w:color w:val="666666"/>
           <w:sz w:val="32"/>
           <w:szCs w:val="32"/>
         </w:rPr>
-      </w:pPr>
-      <w:r>
+        <w:t>[Date]</w:t>
+      </w:r>
+      <w:r>
+        <w:br w:type="page"/>
+      </w:r>
+    </w:p>
+    <w:p>
+      <w:pPr>
+        <w:pBdr>
+          <w:top w:val="nil"/>
+          <w:left w:val="nil"/>
+          <w:bottom w:val="nil"/>
+          <w:right w:val="nil"/>
+          <w:between w:val="nil"/>
+        </w:pBdr>
         <w:rPr>
-          <w:rtl w:val="0"/>
+          <w:rFonts w:ascii="Helvetica Neue" w:eastAsia="Helvetica Neue" w:hAnsi="Helvetica Neue" w:cs="Helvetica Neue"/>
+          <w:color w:val="666666"/>
+          <w:sz w:val="32"/>
+          <w:szCs w:val="32"/>
         </w:rPr>
-      </w:r>
+      </w:pPr>
     </w:p>
     <w:sdt>
       <w:sdtPr>
         <w:id w:val="436955313"/>
         <w:docPartObj>
           <w:docPartGallery w:val="Table of Contents"/>
-          <w:docPartUnique w:val="1"/>
+          <w:docPartUnique/>
         </w:docPartObj>
       </w:sdtPr>
       <w:sdtContent>
@@ -209,214 +173,178 @@
           <w:pPr>
             <w:widowControl w:val="0"/>
             <w:tabs>
-              <w:tab w:val="right" w:leader="none" w:pos="12000"/>
+              <w:tab w:val="right" w:pos="12000"/>
             </w:tabs>
             <w:spacing w:before="60" w:line="240" w:lineRule="auto"/>
             <w:rPr>
-              <w:rFonts w:ascii="Helvetica Neue" w:cs="Helvetica Neue" w:eastAsia="Helvetica Neue" w:hAnsi="Helvetica Neue"/>
-              <w:b w:val="1"/>
-              <w:bCs w:val="1"/>
-              <w:i w:val="0"/>
-              <w:iCs w:val="0"/>
-              <w:smallCaps w:val="0"/>
-              <w:strike w:val="0"/>
+              <w:rFonts w:ascii="Helvetica Neue" w:eastAsia="Helvetica Neue" w:hAnsi="Helvetica Neue" w:cs="Helvetica Neue"/>
+              <w:b/>
+              <w:bCs/>
               <w:color w:val="000000"/>
               <w:sz w:val="24"/>
               <w:szCs w:val="24"/>
-              <w:u w:val="none"/>
-              <w:shd w:fill="auto" w:val="clear"/>
-              <w:vertAlign w:val="baseline"/>
             </w:rPr>
           </w:pPr>
           <w:r>
             <w:fldChar w:fldCharType="begin"/>
+          </w:r>
+          <w:r>
             <w:instrText xml:space="preserve"> TOC \h \u \z \t "Heading 1,1,Heading 2,2,Heading 3,3,Heading 4,4,Heading 5,5,Heading 6,6,"</w:instrText>
+          </w:r>
+          <w:r>
             <w:fldChar w:fldCharType="separate"/>
           </w:r>
           <w:hyperlink w:anchor="_l15awvooqoj6">
             <w:r>
               <w:rPr>
-                <w:rFonts w:ascii="Helvetica Neue" w:cs="Helvetica Neue" w:eastAsia="Helvetica Neue" w:hAnsi="Helvetica Neue"/>
-                <w:b w:val="1"/>
-                <w:bCs w:val="1"/>
-                <w:i w:val="0"/>
-                <w:iCs w:val="0"/>
-                <w:smallCaps w:val="0"/>
-                <w:strike w:val="0"/>
+                <w:rFonts w:ascii="Helvetica Neue" w:eastAsia="Helvetica Neue" w:hAnsi="Helvetica Neue" w:cs="Helvetica Neue"/>
+                <w:b/>
+                <w:bCs/>
                 <w:color w:val="000000"/>
                 <w:sz w:val="24"/>
                 <w:szCs w:val="24"/>
-                <w:u w:val="none"/>
-                <w:shd w:fill="auto" w:val="clear"/>
-                <w:vertAlign w:val="baseline"/>
-                <w:rtl w:val="0"/>
               </w:rPr>
-              <w:t xml:space="preserve">Overview</w:t>
+              <w:t>Overview</w:t>
+            </w:r>
+            <w:r>
+              <w:rPr>
+                <w:rFonts w:ascii="Helvetica Neue" w:eastAsia="Helvetica Neue" w:hAnsi="Helvetica Neue" w:cs="Helvetica Neue"/>
+                <w:b/>
+                <w:bCs/>
+                <w:color w:val="000000"/>
+                <w:sz w:val="24"/>
+                <w:szCs w:val="24"/>
+              </w:rPr>
               <w:tab/>
-              <w:t xml:space="preserve">2</w:t>
+              <w:t>2</w:t>
             </w:r>
           </w:hyperlink>
-          <w:r>
-            <w:rPr>
-              <w:rtl w:val="0"/>
-            </w:rPr>
-          </w:r>
         </w:p>
         <w:p>
           <w:pPr>
             <w:widowControl w:val="0"/>
             <w:tabs>
-              <w:tab w:val="right" w:leader="none" w:pos="12000"/>
+              <w:tab w:val="right" w:pos="12000"/>
             </w:tabs>
             <w:spacing w:before="60" w:line="240" w:lineRule="auto"/>
             <w:rPr>
-              <w:rFonts w:ascii="Helvetica Neue" w:cs="Helvetica Neue" w:eastAsia="Helvetica Neue" w:hAnsi="Helvetica Neue"/>
-              <w:b w:val="1"/>
-              <w:bCs w:val="1"/>
-              <w:i w:val="0"/>
-              <w:iCs w:val="0"/>
-              <w:smallCaps w:val="0"/>
-              <w:strike w:val="0"/>
+              <w:rFonts w:ascii="Helvetica Neue" w:eastAsia="Helvetica Neue" w:hAnsi="Helvetica Neue" w:cs="Helvetica Neue"/>
+              <w:b/>
+              <w:bCs/>
               <w:color w:val="000000"/>
               <w:sz w:val="24"/>
               <w:szCs w:val="24"/>
-              <w:u w:val="none"/>
-              <w:shd w:fill="auto" w:val="clear"/>
-              <w:vertAlign w:val="baseline"/>
             </w:rPr>
           </w:pPr>
           <w:hyperlink w:anchor="_ovawxjoi07ia">
             <w:r>
               <w:rPr>
-                <w:rFonts w:ascii="Helvetica Neue" w:cs="Helvetica Neue" w:eastAsia="Helvetica Neue" w:hAnsi="Helvetica Neue"/>
-                <w:b w:val="1"/>
-                <w:bCs w:val="1"/>
-                <w:i w:val="0"/>
-                <w:iCs w:val="0"/>
-                <w:smallCaps w:val="0"/>
-                <w:strike w:val="0"/>
+                <w:rFonts w:ascii="Helvetica Neue" w:eastAsia="Helvetica Neue" w:hAnsi="Helvetica Neue" w:cs="Helvetica Neue"/>
+                <w:b/>
+                <w:bCs/>
                 <w:color w:val="000000"/>
                 <w:sz w:val="24"/>
                 <w:szCs w:val="24"/>
-                <w:u w:val="none"/>
-                <w:shd w:fill="auto" w:val="clear"/>
-                <w:vertAlign w:val="baseline"/>
-                <w:rtl w:val="0"/>
               </w:rPr>
-              <w:t xml:space="preserve">Steps</w:t>
+              <w:t>Steps</w:t>
+            </w:r>
+            <w:r>
+              <w:rPr>
+                <w:rFonts w:ascii="Helvetica Neue" w:eastAsia="Helvetica Neue" w:hAnsi="Helvetica Neue" w:cs="Helvetica Neue"/>
+                <w:b/>
+                <w:bCs/>
+                <w:color w:val="000000"/>
+                <w:sz w:val="24"/>
+                <w:szCs w:val="24"/>
+              </w:rPr>
               <w:tab/>
-              <w:t xml:space="preserve">3</w:t>
+              <w:t>3</w:t>
             </w:r>
           </w:hyperlink>
-          <w:r>
-            <w:rPr>
-              <w:rtl w:val="0"/>
-            </w:rPr>
-          </w:r>
         </w:p>
         <w:p>
           <w:pPr>
             <w:widowControl w:val="0"/>
             <w:tabs>
-              <w:tab w:val="right" w:leader="none" w:pos="12000"/>
+              <w:tab w:val="right" w:pos="12000"/>
             </w:tabs>
             <w:spacing w:before="60" w:line="240" w:lineRule="auto"/>
             <w:rPr>
-              <w:rFonts w:ascii="Helvetica Neue" w:cs="Helvetica Neue" w:eastAsia="Helvetica Neue" w:hAnsi="Helvetica Neue"/>
-              <w:b w:val="1"/>
-              <w:bCs w:val="1"/>
-              <w:i w:val="0"/>
-              <w:iCs w:val="0"/>
-              <w:smallCaps w:val="0"/>
-              <w:strike w:val="0"/>
+              <w:rFonts w:ascii="Helvetica Neue" w:eastAsia="Helvetica Neue" w:hAnsi="Helvetica Neue" w:cs="Helvetica Neue"/>
+              <w:b/>
+              <w:bCs/>
               <w:color w:val="000000"/>
               <w:sz w:val="24"/>
               <w:szCs w:val="24"/>
-              <w:u w:val="none"/>
-              <w:shd w:fill="auto" w:val="clear"/>
-              <w:vertAlign w:val="baseline"/>
             </w:rPr>
           </w:pPr>
           <w:hyperlink w:anchor="_i85ws8se9wc5">
             <w:r>
               <w:rPr>
-                <w:rFonts w:ascii="Helvetica Neue" w:cs="Helvetica Neue" w:eastAsia="Helvetica Neue" w:hAnsi="Helvetica Neue"/>
-                <w:b w:val="1"/>
-                <w:bCs w:val="1"/>
-                <w:i w:val="0"/>
-                <w:iCs w:val="0"/>
-                <w:smallCaps w:val="0"/>
-                <w:strike w:val="0"/>
+                <w:rFonts w:ascii="Helvetica Neue" w:eastAsia="Helvetica Neue" w:hAnsi="Helvetica Neue" w:cs="Helvetica Neue"/>
+                <w:b/>
+                <w:bCs/>
                 <w:color w:val="000000"/>
                 <w:sz w:val="24"/>
                 <w:szCs w:val="24"/>
-                <w:u w:val="none"/>
-                <w:shd w:fill="auto" w:val="clear"/>
-                <w:vertAlign w:val="baseline"/>
-                <w:rtl w:val="0"/>
               </w:rPr>
-              <w:t xml:space="preserve">Conclusion</w:t>
+              <w:t>Conclusion</w:t>
+            </w:r>
+            <w:r>
+              <w:rPr>
+                <w:rFonts w:ascii="Helvetica Neue" w:eastAsia="Helvetica Neue" w:hAnsi="Helvetica Neue" w:cs="Helvetica Neue"/>
+                <w:b/>
+                <w:bCs/>
+                <w:color w:val="000000"/>
+                <w:sz w:val="24"/>
+                <w:szCs w:val="24"/>
+              </w:rPr>
               <w:tab/>
-              <w:t xml:space="preserve">4</w:t>
+              <w:t>4</w:t>
             </w:r>
           </w:hyperlink>
-          <w:r>
-            <w:rPr>
-              <w:rtl w:val="0"/>
-            </w:rPr>
-          </w:r>
         </w:p>
         <w:p>
           <w:pPr>
             <w:widowControl w:val="0"/>
             <w:tabs>
-              <w:tab w:val="right" w:leader="none" w:pos="12000"/>
+              <w:tab w:val="right" w:pos="12000"/>
             </w:tabs>
             <w:spacing w:before="60" w:line="240" w:lineRule="auto"/>
             <w:rPr>
-              <w:rFonts w:ascii="Helvetica Neue" w:cs="Helvetica Neue" w:eastAsia="Helvetica Neue" w:hAnsi="Helvetica Neue"/>
-              <w:b w:val="1"/>
-              <w:bCs w:val="1"/>
-              <w:i w:val="0"/>
-              <w:iCs w:val="0"/>
-              <w:smallCaps w:val="0"/>
-              <w:strike w:val="0"/>
+              <w:rFonts w:ascii="Helvetica Neue" w:eastAsia="Helvetica Neue" w:hAnsi="Helvetica Neue" w:cs="Helvetica Neue"/>
+              <w:b/>
+              <w:bCs/>
               <w:color w:val="000000"/>
               <w:sz w:val="24"/>
               <w:szCs w:val="24"/>
-              <w:u w:val="none"/>
-              <w:shd w:fill="auto" w:val="clear"/>
-              <w:vertAlign w:val="baseline"/>
             </w:rPr>
           </w:pPr>
           <w:hyperlink w:anchor="_4nwtygxbthbx">
             <w:r>
               <w:rPr>
-                <w:rFonts w:ascii="Helvetica Neue" w:cs="Helvetica Neue" w:eastAsia="Helvetica Neue" w:hAnsi="Helvetica Neue"/>
-                <w:b w:val="1"/>
-                <w:bCs w:val="1"/>
-                <w:i w:val="0"/>
-                <w:iCs w:val="0"/>
-                <w:smallCaps w:val="0"/>
-                <w:strike w:val="0"/>
+                <w:rFonts w:ascii="Helvetica Neue" w:eastAsia="Helvetica Neue" w:hAnsi="Helvetica Neue" w:cs="Helvetica Neue"/>
+                <w:b/>
+                <w:bCs/>
                 <w:color w:val="000000"/>
                 <w:sz w:val="24"/>
                 <w:szCs w:val="24"/>
-                <w:u w:val="none"/>
-                <w:shd w:fill="auto" w:val="clear"/>
-                <w:vertAlign w:val="baseline"/>
-                <w:rtl w:val="0"/>
               </w:rPr>
-              <w:t xml:space="preserve">Appendix</w:t>
+              <w:t>Appendix</w:t>
+            </w:r>
+            <w:r>
+              <w:rPr>
+                <w:rFonts w:ascii="Helvetica Neue" w:eastAsia="Helvetica Neue" w:hAnsi="Helvetica Neue" w:cs="Helvetica Neue"/>
+                <w:b/>
+                <w:bCs/>
+                <w:color w:val="000000"/>
+                <w:sz w:val="24"/>
+                <w:szCs w:val="24"/>
+              </w:rPr>
               <w:tab/>
-              <w:t xml:space="preserve">5</w:t>
+              <w:t>5</w:t>
             </w:r>
           </w:hyperlink>
-          <w:r>
-            <w:rPr>
-              <w:rtl w:val="0"/>
-            </w:rPr>
-          </w:r>
           <w:r>
             <w:fldChar w:fldCharType="end"/>
           </w:r>
@@ -425,82 +353,62 @@
     </w:sdt>
     <w:p>
       <w:pPr>
-        <w:spacing w:after="360" w:before="360" w:line="360" w:lineRule="auto"/>
-        <w:rPr/>
+        <w:spacing w:before="360" w:after="360" w:line="360" w:lineRule="auto"/>
       </w:pPr>
       <w:r>
         <w:br w:type="page"/>
-      </w:r>
-      <w:r>
-        <w:rPr>
-          <w:rtl w:val="0"/>
-        </w:rPr>
       </w:r>
     </w:p>
     <w:p>
       <w:pPr>
         <w:pStyle w:val="Heading2"/>
-        <w:spacing w:after="360" w:before="0" w:line="360" w:lineRule="auto"/>
-        <w:rPr/>
-      </w:pPr>
-      <w:bookmarkStart w:colFirst="0" w:colLast="0" w:name="_l15awvooqoj6" w:id="2"/>
+        <w:spacing w:before="0" w:after="360" w:line="360" w:lineRule="auto"/>
+      </w:pPr>
+      <w:bookmarkStart w:id="2" w:name="_l15awvooqoj6" w:colFirst="0" w:colLast="0"/>
       <w:bookmarkEnd w:id="2"/>
       <w:r>
-        <w:rPr>
-          <w:rtl w:val="0"/>
-        </w:rPr>
-        <w:t xml:space="preserve">Overview</w:t>
+        <w:lastRenderedPageBreak/>
+        <w:t>Overview</w:t>
       </w:r>
     </w:p>
     <w:p>
       <w:pPr>
-        <w:pageBreakBefore w:val="0"/>
         <w:pBdr>
-          <w:top w:space="0" w:sz="0" w:val="nil"/>
-          <w:left w:space="0" w:sz="0" w:val="nil"/>
-          <w:bottom w:space="0" w:sz="0" w:val="nil"/>
-          <w:right w:space="0" w:sz="0" w:val="nil"/>
-          <w:between w:space="0" w:sz="0" w:val="nil"/>
+          <w:top w:val="nil"/>
+          <w:left w:val="nil"/>
+          <w:bottom w:val="nil"/>
+          <w:right w:val="nil"/>
+          <w:between w:val="nil"/>
         </w:pBdr>
-        <w:shd w:fill="auto" w:val="clear"/>
-        <w:spacing w:after="240" w:before="0" w:line="360" w:lineRule="auto"/>
+        <w:spacing w:before="0" w:after="240" w:line="360" w:lineRule="auto"/>
         <w:rPr>
-          <w:rFonts w:ascii="Helvetica Neue" w:cs="Helvetica Neue" w:eastAsia="Helvetica Neue" w:hAnsi="Helvetica Neue"/>
+          <w:rFonts w:ascii="Helvetica Neue" w:eastAsia="Helvetica Neue" w:hAnsi="Helvetica Neue" w:cs="Helvetica Neue"/>
           <w:sz w:val="24"/>
           <w:szCs w:val="24"/>
         </w:rPr>
       </w:pPr>
       <w:r>
         <w:rPr>
-          <w:rFonts w:ascii="Helvetica Neue" w:cs="Helvetica Neue" w:eastAsia="Helvetica Neue" w:hAnsi="Helvetica Neue"/>
+          <w:rFonts w:ascii="Helvetica Neue" w:eastAsia="Helvetica Neue" w:hAnsi="Helvetica Neue" w:cs="Helvetica Neue"/>
           <w:sz w:val="24"/>
           <w:szCs w:val="24"/>
-          <w:rtl w:val="0"/>
         </w:rPr>
-        <w:t xml:space="preserve">[Create a short summary of what was achieved in your lab]</w:t>
+        <w:t>[Create a short summary of what was achieved in your lab]</w:t>
       </w:r>
       <w:r>
         <w:br w:type="page"/>
-      </w:r>
-      <w:r>
-        <w:rPr>
-          <w:rtl w:val="0"/>
-        </w:rPr>
       </w:r>
     </w:p>
     <w:p>
       <w:pPr>
         <w:pStyle w:val="Heading2"/>
-        <w:spacing w:after="360" w:before="0" w:line="360" w:lineRule="auto"/>
-        <w:rPr/>
-      </w:pPr>
-      <w:bookmarkStart w:colFirst="0" w:colLast="0" w:name="_ovawxjoi07ia" w:id="3"/>
+        <w:spacing w:before="0" w:after="360" w:line="360" w:lineRule="auto"/>
+      </w:pPr>
+      <w:bookmarkStart w:id="3" w:name="_ovawxjoi07ia" w:colFirst="0" w:colLast="0"/>
       <w:bookmarkEnd w:id="3"/>
       <w:r>
-        <w:rPr>
-          <w:rtl w:val="0"/>
-        </w:rPr>
-        <w:t xml:space="preserve">Steps</w:t>
+        <w:lastRenderedPageBreak/>
+        <w:t>Steps</w:t>
       </w:r>
     </w:p>
     <w:p>
@@ -509,61 +417,59 @@
           <w:ilvl w:val="0"/>
           <w:numId w:val="1"/>
         </w:numPr>
-        <w:spacing w:after="240" w:before="0" w:line="360" w:lineRule="auto"/>
-        <w:ind w:left="720" w:hanging="360"/>
+        <w:spacing w:before="0" w:after="240" w:line="360" w:lineRule="auto"/>
         <w:rPr>
-          <w:rFonts w:ascii="Helvetica Neue" w:cs="Helvetica Neue" w:eastAsia="Helvetica Neue" w:hAnsi="Helvetica Neue"/>
+          <w:rFonts w:ascii="Helvetica Neue" w:eastAsia="Helvetica Neue" w:hAnsi="Helvetica Neue" w:cs="Helvetica Neue"/>
           <w:sz w:val="24"/>
           <w:szCs w:val="24"/>
         </w:rPr>
       </w:pPr>
       <w:r>
         <w:rPr>
-          <w:rFonts w:ascii="Helvetica Neue" w:cs="Helvetica Neue" w:eastAsia="Helvetica Neue" w:hAnsi="Helvetica Neue"/>
+          <w:rFonts w:ascii="Helvetica Neue" w:eastAsia="Helvetica Neue" w:hAnsi="Helvetica Neue" w:cs="Helvetica Neue"/>
           <w:sz w:val="24"/>
           <w:szCs w:val="24"/>
-          <w:rtl w:val="0"/>
         </w:rPr>
-        <w:t xml:space="preserve">[Detail the steps you took to do the tasks in the lab and add screenshots as proof of completion ]</w:t>
-      </w:r>
+        <w:t xml:space="preserve">[Detail the steps you took to do the tasks in the lab and add screenshots as proof of </w:t>
+      </w:r>
+      <w:proofErr w:type="gramStart"/>
+      <w:r>
+        <w:rPr>
+          <w:rFonts w:ascii="Helvetica Neue" w:eastAsia="Helvetica Neue" w:hAnsi="Helvetica Neue" w:cs="Helvetica Neue"/>
+          <w:sz w:val="24"/>
+          <w:szCs w:val="24"/>
+        </w:rPr>
+        <w:t>completion ]</w:t>
+      </w:r>
+      <w:proofErr w:type="gramEnd"/>
       <w:r>
         <w:br w:type="page"/>
-      </w:r>
-      <w:r>
-        <w:rPr>
-          <w:rtl w:val="0"/>
-        </w:rPr>
       </w:r>
     </w:p>
     <w:p>
       <w:pPr>
         <w:pStyle w:val="Heading2"/>
-        <w:spacing w:after="360" w:before="0" w:line="360" w:lineRule="auto"/>
-        <w:rPr/>
-      </w:pPr>
-      <w:bookmarkStart w:colFirst="0" w:colLast="0" w:name="_i85ws8se9wc5" w:id="4"/>
+        <w:spacing w:before="0" w:after="360" w:line="360" w:lineRule="auto"/>
+      </w:pPr>
+      <w:bookmarkStart w:id="4" w:name="_i85ws8se9wc5" w:colFirst="0" w:colLast="0"/>
       <w:bookmarkEnd w:id="4"/>
       <w:r>
-        <w:rPr>
-          <w:rtl w:val="0"/>
-        </w:rPr>
-        <w:t xml:space="preserve">Conclusion</w:t>
+        <w:lastRenderedPageBreak/>
+        <w:t>Conclusion</w:t>
       </w:r>
     </w:p>
     <w:p>
       <w:pPr>
-        <w:pageBreakBefore w:val="0"/>
         <w:pBdr>
-          <w:top w:space="0" w:sz="0" w:val="nil"/>
-          <w:left w:space="0" w:sz="0" w:val="nil"/>
-          <w:bottom w:space="0" w:sz="0" w:val="nil"/>
-          <w:right w:space="0" w:sz="0" w:val="nil"/>
-          <w:between w:space="0" w:sz="0" w:val="nil"/>
+          <w:top w:val="nil"/>
+          <w:left w:val="nil"/>
+          <w:bottom w:val="nil"/>
+          <w:right w:val="nil"/>
+          <w:between w:val="nil"/>
         </w:pBdr>
-        <w:shd w:fill="auto" w:val="clear"/>
-        <w:spacing w:after="240" w:before="0" w:line="360" w:lineRule="auto"/>
+        <w:spacing w:before="0" w:after="240" w:line="360" w:lineRule="auto"/>
         <w:rPr>
-          <w:rFonts w:ascii="Helvetica Neue" w:cs="Helvetica Neue" w:eastAsia="Helvetica Neue" w:hAnsi="Helvetica Neue"/>
+          <w:rFonts w:ascii="Helvetica Neue" w:eastAsia="Helvetica Neue" w:hAnsi="Helvetica Neue" w:cs="Helvetica Neue"/>
           <w:color w:val="404040"/>
           <w:sz w:val="24"/>
           <w:szCs w:val="24"/>
@@ -571,76 +477,118 @@
       </w:pPr>
       <w:r>
         <w:rPr>
-          <w:rFonts w:ascii="Helvetica Neue" w:cs="Helvetica Neue" w:eastAsia="Helvetica Neue" w:hAnsi="Helvetica Neue"/>
+          <w:rFonts w:ascii="Helvetica Neue" w:eastAsia="Helvetica Neue" w:hAnsi="Helvetica Neue" w:cs="Helvetica Neue"/>
           <w:color w:val="404040"/>
           <w:sz w:val="24"/>
           <w:szCs w:val="24"/>
-          <w:rtl w:val="0"/>
         </w:rPr>
-        <w:t xml:space="preserve">[Add any takeaways about the lab]</w:t>
+        <w:t>[Add any takeaways about the lab]</w:t>
       </w:r>
       <w:r>
         <w:br w:type="page"/>
-      </w:r>
-      <w:r>
-        <w:rPr>
-          <w:rtl w:val="0"/>
-        </w:rPr>
       </w:r>
     </w:p>
     <w:p>
       <w:pPr>
         <w:pStyle w:val="Heading2"/>
-        <w:spacing w:after="360" w:before="0" w:line="360" w:lineRule="auto"/>
-        <w:rPr/>
-      </w:pPr>
-      <w:bookmarkStart w:colFirst="0" w:colLast="0" w:name="_4nwtygxbthbx" w:id="5"/>
+        <w:spacing w:before="0" w:after="360" w:line="360" w:lineRule="auto"/>
+      </w:pPr>
+      <w:bookmarkStart w:id="5" w:name="_4nwtygxbthbx" w:colFirst="0" w:colLast="0"/>
       <w:bookmarkEnd w:id="5"/>
       <w:r>
-        <w:rPr>
-          <w:rtl w:val="0"/>
-        </w:rPr>
-        <w:t xml:space="preserve">Appendix</w:t>
+        <w:lastRenderedPageBreak/>
+        <w:t>Appendix</w:t>
       </w:r>
     </w:p>
     <w:sectPr>
-      <w:headerReference r:id="rId7" w:type="default"/>
-      <w:headerReference r:id="rId8" w:type="first"/>
-      <w:footerReference r:id="rId9" w:type="default"/>
-      <w:footerReference r:id="rId10" w:type="first"/>
-      <w:pgSz w:h="15840" w:w="12240" w:orient="portrait"/>
-      <w:pgMar w:bottom="1440" w:top="1440" w:left="1440" w:right="1440" w:header="0" w:footer="720"/>
+      <w:headerReference w:type="even" r:id="rId8"/>
+      <w:headerReference w:type="default" r:id="rId9"/>
+      <w:footerReference w:type="even" r:id="rId10"/>
+      <w:footerReference w:type="default" r:id="rId11"/>
+      <w:headerReference w:type="first" r:id="rId12"/>
+      <w:footerReference w:type="first" r:id="rId13"/>
+      <w:pgSz w:w="12240" w:h="15840"/>
+      <w:pgMar w:top="1440" w:right="1440" w:bottom="1440" w:left="1440" w:header="0" w:footer="720" w:gutter="0"/>
       <w:pgNumType w:start="0"/>
-      <w:titlePg w:val="1"/>
+      <w:cols w:space="720"/>
+      <w:titlePg/>
     </w:sectPr>
   </w:body>
 </w:document>
 </file>
 
+<file path=word/endnotes.xml><?xml version="1.0" encoding="utf-8"?>
+<w:endnotes xmlns:wpc="http://schemas.microsoft.com/office/word/2010/wordprocessingCanvas" xmlns:cx="http://schemas.microsoft.com/office/drawing/2014/chartex" xmlns:cx1="http://schemas.microsoft.com/office/drawing/2015/9/8/chartex" xmlns:cx2="http://schemas.microsoft.com/office/drawing/2015/10/21/chartex" xmlns:cx3="http://schemas.microsoft.com/office/drawing/2016/5/9/chartex" xmlns:cx4="http://schemas.microsoft.com/office/drawing/2016/5/10/chartex" xmlns:cx5="http://schemas.microsoft.com/office/drawing/2016/5/11/chartex" xmlns:cx6="http://schemas.microsoft.com/office/drawing/2016/5/12/chartex" xmlns:cx7="http://schemas.microsoft.com/office/drawing/2016/5/13/chartex" xmlns:cx8="http://schemas.microsoft.com/office/drawing/2016/5/14/chartex" xmlns:mc="http://schemas.openxmlformats.org/markup-compatibility/2006" xmlns:aink="http://schemas.microsoft.com/office/drawing/2016/ink" xmlns:am3d="http://schemas.microsoft.com/office/drawing/2017/model3d" xmlns:o="urn:schemas-microsoft-com:office:office" xmlns:oel="http://schemas.microsoft.com/office/2019/extlst" xmlns:r="http://schemas.openxmlformats.org/officeDocument/2006/relationships" xmlns:m="http://schemas.openxmlformats.org/officeDocument/2006/math" xmlns:v="urn:schemas-microsoft-com:vml" xmlns:wp14="http://schemas.microsoft.com/office/word/2010/wordprocessingDrawing" xmlns:wp="http://schemas.openxmlformats.org/drawingml/2006/wordprocessingDrawing" xmlns:w10="urn:schemas-microsoft-com:office:word" xmlns:w="http://schemas.openxmlformats.org/wordprocessingml/2006/main" xmlns:w14="http://schemas.microsoft.com/office/word/2010/wordml" xmlns:w15="http://schemas.microsoft.com/office/word/2012/wordml" xmlns:w16cex="http://schemas.microsoft.com/office/word/2018/wordml/cex" xmlns:w16cid="http://schemas.microsoft.com/office/word/2016/wordml/cid" xmlns:w16="http://schemas.microsoft.com/office/word/2018/wordml" xmlns:w16du="http://schemas.microsoft.com/office/word/2023/wordml/word16du" xmlns:w16sdtdh="http://schemas.microsoft.com/office/word/2020/wordml/sdtdatahash" xmlns:w16sdtfl="http://schemas.microsoft.com/office/word/2024/wordml/sdtformatlock" xmlns:w16se="http://schemas.microsoft.com/office/word/2015/wordml/symex" xmlns:wpg="http://schemas.microsoft.com/office/word/2010/wordprocessingGroup" xmlns:wpi="http://schemas.microsoft.com/office/word/2010/wordprocessingInk" xmlns:wne="http://schemas.microsoft.com/office/word/2006/wordml" xmlns:wps="http://schemas.microsoft.com/office/word/2010/wordprocessingShape" mc:Ignorable="w14 w15 w16se w16cid w16 w16cex w16sdtdh w16sdtfl w16du wp14">
+  <w:endnote w:type="separator" w:id="-1">
+    <w:p>
+      <w:pPr>
+        <w:spacing w:before="0" w:line="240" w:lineRule="auto"/>
+      </w:pPr>
+      <w:r>
+        <w:separator/>
+      </w:r>
+    </w:p>
+  </w:endnote>
+  <w:endnote w:type="continuationSeparator" w:id="0">
+    <w:p>
+      <w:pPr>
+        <w:spacing w:before="0" w:line="240" w:lineRule="auto"/>
+      </w:pPr>
+      <w:r>
+        <w:continuationSeparator/>
+      </w:r>
+    </w:p>
+  </w:endnote>
+</w:endnotes>
+</file>
+
 <file path=word/footer1.xml><?xml version="1.0" encoding="utf-8"?>
-<w:ftr xmlns:mc="http://schemas.openxmlformats.org/markup-compatibility/2006" xmlns:o="urn:schemas-microsoft-com:office:office" xmlns:r="http://schemas.openxmlformats.org/officeDocument/2006/relationships" xmlns:m="http://schemas.openxmlformats.org/officeDocument/2006/math" xmlns:v="urn:schemas-microsoft-com:vml" xmlns:wp="http://schemas.openxmlformats.org/drawingml/2006/wordprocessingDrawing" xmlns:w10="urn:schemas-microsoft-com:office:word" xmlns:w="http://schemas.openxmlformats.org/wordprocessingml/2006/main" xmlns:wne="http://schemas.microsoft.com/office/word/2006/wordml" xmlns:sl="http://schemas.openxmlformats.org/schemaLibrary/2006/main" xmlns:a="http://schemas.openxmlformats.org/drawingml/2006/main" xmlns:pic="http://schemas.openxmlformats.org/drawingml/2006/picture" xmlns:c="http://schemas.openxmlformats.org/drawingml/2006/chart" xmlns:lc="http://schemas.openxmlformats.org/drawingml/2006/lockedCanvas" xmlns:dgm="http://schemas.openxmlformats.org/drawingml/2006/diagram" xmlns:wps="http://schemas.microsoft.com/office/word/2010/wordprocessingShape" xmlns:wpg="http://schemas.microsoft.com/office/word/2010/wordprocessingGroup" xmlns:w14="http://schemas.microsoft.com/office/word/2010/wordml" xmlns:w15="http://schemas.microsoft.com/office/word/2012/wordml" xmlns:w16="http://schemas.microsoft.com/office/word/2018/wordml" xmlns:w16cex="http://schemas.microsoft.com/office/word/2018/wordml/cex" xmlns:w16cid="http://schemas.microsoft.com/office/word/2016/wordml/cid" xmlns="http://schemas.microsoft.com/office/tasks/2019/documenttasks" xmlns:cr="http://schemas.microsoft.com/office/comments/2020/reactions">
+<w:ftr xmlns:wpc="http://schemas.microsoft.com/office/word/2010/wordprocessingCanvas" xmlns:cx="http://schemas.microsoft.com/office/drawing/2014/chartex" xmlns:cx1="http://schemas.microsoft.com/office/drawing/2015/9/8/chartex" xmlns:cx2="http://schemas.microsoft.com/office/drawing/2015/10/21/chartex" xmlns:cx3="http://schemas.microsoft.com/office/drawing/2016/5/9/chartex" xmlns:cx4="http://schemas.microsoft.com/office/drawing/2016/5/10/chartex" xmlns:cx5="http://schemas.microsoft.com/office/drawing/2016/5/11/chartex" xmlns:cx6="http://schemas.microsoft.com/office/drawing/2016/5/12/chartex" xmlns:cx7="http://schemas.microsoft.com/office/drawing/2016/5/13/chartex" xmlns:cx8="http://schemas.microsoft.com/office/drawing/2016/5/14/chartex" xmlns:mc="http://schemas.openxmlformats.org/markup-compatibility/2006" xmlns:aink="http://schemas.microsoft.com/office/drawing/2016/ink" xmlns:am3d="http://schemas.microsoft.com/office/drawing/2017/model3d" xmlns:o="urn:schemas-microsoft-com:office:office" xmlns:oel="http://schemas.microsoft.com/office/2019/extlst" xmlns:r="http://schemas.openxmlformats.org/officeDocument/2006/relationships" xmlns:m="http://schemas.openxmlformats.org/officeDocument/2006/math" xmlns:v="urn:schemas-microsoft-com:vml" xmlns:wp14="http://schemas.microsoft.com/office/word/2010/wordprocessingDrawing" xmlns:wp="http://schemas.openxmlformats.org/drawingml/2006/wordprocessingDrawing" xmlns:w10="urn:schemas-microsoft-com:office:word" xmlns:w="http://schemas.openxmlformats.org/wordprocessingml/2006/main" xmlns:w14="http://schemas.microsoft.com/office/word/2010/wordml" xmlns:w15="http://schemas.microsoft.com/office/word/2012/wordml" xmlns:w16cex="http://schemas.microsoft.com/office/word/2018/wordml/cex" xmlns:w16cid="http://schemas.microsoft.com/office/word/2016/wordml/cid" xmlns:w16="http://schemas.microsoft.com/office/word/2018/wordml" xmlns:w16du="http://schemas.microsoft.com/office/word/2023/wordml/word16du" xmlns:w16sdtdh="http://schemas.microsoft.com/office/word/2020/wordml/sdtdatahash" xmlns:w16sdtfl="http://schemas.microsoft.com/office/word/2024/wordml/sdtformatlock" xmlns:w16se="http://schemas.microsoft.com/office/word/2015/wordml/symex" xmlns:wpg="http://schemas.microsoft.com/office/word/2010/wordprocessingGroup" xmlns:wpi="http://schemas.microsoft.com/office/word/2010/wordprocessingInk" xmlns:wne="http://schemas.microsoft.com/office/word/2006/wordml" xmlns:wps="http://schemas.microsoft.com/office/word/2010/wordprocessingShape" mc:Ignorable="w14 w15 w16se w16cid w16 w16cex w16sdtdh w16sdtfl w16du wp14">
   <w:p>
     <w:pPr>
-      <w:pageBreakBefore w:val="0"/>
+      <w:pStyle w:val="Footer"/>
+    </w:pPr>
+  </w:p>
+</w:ftr>
+</file>
+
+<file path=word/footer2.xml><?xml version="1.0" encoding="utf-8"?>
+<w:ftr xmlns:wpc="http://schemas.microsoft.com/office/word/2010/wordprocessingCanvas" xmlns:cx="http://schemas.microsoft.com/office/drawing/2014/chartex" xmlns:cx1="http://schemas.microsoft.com/office/drawing/2015/9/8/chartex" xmlns:cx2="http://schemas.microsoft.com/office/drawing/2015/10/21/chartex" xmlns:cx3="http://schemas.microsoft.com/office/drawing/2016/5/9/chartex" xmlns:cx4="http://schemas.microsoft.com/office/drawing/2016/5/10/chartex" xmlns:cx5="http://schemas.microsoft.com/office/drawing/2016/5/11/chartex" xmlns:cx6="http://schemas.microsoft.com/office/drawing/2016/5/12/chartex" xmlns:cx7="http://schemas.microsoft.com/office/drawing/2016/5/13/chartex" xmlns:cx8="http://schemas.microsoft.com/office/drawing/2016/5/14/chartex" xmlns:mc="http://schemas.openxmlformats.org/markup-compatibility/2006" xmlns:aink="http://schemas.microsoft.com/office/drawing/2016/ink" xmlns:am3d="http://schemas.microsoft.com/office/drawing/2017/model3d" xmlns:o="urn:schemas-microsoft-com:office:office" xmlns:oel="http://schemas.microsoft.com/office/2019/extlst" xmlns:r="http://schemas.openxmlformats.org/officeDocument/2006/relationships" xmlns:m="http://schemas.openxmlformats.org/officeDocument/2006/math" xmlns:v="urn:schemas-microsoft-com:vml" xmlns:wp14="http://schemas.microsoft.com/office/word/2010/wordprocessingDrawing" xmlns:wp="http://schemas.openxmlformats.org/drawingml/2006/wordprocessingDrawing" xmlns:w10="urn:schemas-microsoft-com:office:word" xmlns:w="http://schemas.openxmlformats.org/wordprocessingml/2006/main" xmlns:w14="http://schemas.microsoft.com/office/word/2010/wordml" xmlns:w15="http://schemas.microsoft.com/office/word/2012/wordml" xmlns:w16cex="http://schemas.microsoft.com/office/word/2018/wordml/cex" xmlns:w16cid="http://schemas.microsoft.com/office/word/2016/wordml/cid" xmlns:w16="http://schemas.microsoft.com/office/word/2018/wordml" xmlns:w16du="http://schemas.microsoft.com/office/word/2023/wordml/word16du" xmlns:w16sdtdh="http://schemas.microsoft.com/office/word/2020/wordml/sdtdatahash" xmlns:w16sdtfl="http://schemas.microsoft.com/office/word/2024/wordml/sdtformatlock" xmlns:w16se="http://schemas.microsoft.com/office/word/2015/wordml/symex" xmlns:wpg="http://schemas.microsoft.com/office/word/2010/wordprocessingGroup" xmlns:wpi="http://schemas.microsoft.com/office/word/2010/wordprocessingInk" xmlns:wne="http://schemas.microsoft.com/office/word/2006/wordml" xmlns:wps="http://schemas.microsoft.com/office/word/2010/wordprocessingShape" mc:Ignorable="w14 w15 w16se w16cid w16 w16cex w16sdtdh w16sdtfl w16du wp14">
+  <w:p>
+    <w:pPr>
       <w:pBdr>
-        <w:top w:space="0" w:sz="0" w:val="nil"/>
-        <w:left w:space="0" w:sz="0" w:val="nil"/>
-        <w:bottom w:space="0" w:sz="0" w:val="nil"/>
-        <w:right w:space="0" w:sz="0" w:val="nil"/>
-        <w:between w:space="0" w:sz="0" w:val="nil"/>
+        <w:top w:val="nil"/>
+        <w:left w:val="nil"/>
+        <w:bottom w:val="nil"/>
+        <w:right w:val="nil"/>
+        <w:between w:val="nil"/>
       </w:pBdr>
-      <w:shd w:fill="auto" w:val="clear"/>
       <w:jc w:val="right"/>
-      <w:rPr/>
     </w:pPr>
     <w:r>
-      <w:rPr>
-        <w:rtl w:val="0"/>
-      </w:rPr>
+      <w:fldChar w:fldCharType="begin"/>
     </w:r>
     <w:r>
+      <w:instrText>PAGE</w:instrText>
+    </w:r>
+    <w:r>
+      <w:fldChar w:fldCharType="separate"/>
+    </w:r>
+    <w:r>
+      <w:rPr>
+        <w:noProof/>
+      </w:rPr>
+      <w:t>1</w:t>
+    </w:r>
+    <w:r>
+      <w:fldChar w:fldCharType="end"/>
+    </w:r>
+    <w:r>
+      <w:rPr>
+        <w:noProof/>
+      </w:rPr>
       <w:drawing>
-        <wp:anchor allowOverlap="1" behindDoc="0" distB="0" distT="0" distL="0" distR="0" hidden="0" layoutInCell="1" locked="0" relativeHeight="0" simplePos="0">
+        <wp:anchor distT="0" distB="0" distL="0" distR="0" simplePos="0" relativeHeight="251663360" behindDoc="0" locked="0" layoutInCell="1" hidden="0" allowOverlap="1" wp14:anchorId="726A68DC" wp14:editId="7745B0C3">
           <wp:simplePos x="0" y="0"/>
           <wp:positionH relativeFrom="column">
             <wp:posOffset>-914399</wp:posOffset>
@@ -649,19 +597,20 @@
             <wp:posOffset>438150</wp:posOffset>
           </wp:positionV>
           <wp:extent cx="7781925" cy="409575"/>
-          <wp:effectExtent b="0" l="0" r="0" t="0"/>
-          <wp:wrapTopAndBottom distB="0" distT="0"/>
-          <wp:docPr descr="footer" id="2" name="image6.png"/>
-          <a:graphic>
+          <wp:effectExtent l="0" t="0" r="0" b="0"/>
+          <wp:wrapTopAndBottom distT="0" distB="0"/>
+          <wp:docPr id="1" name="image5.png" descr="footer"/>
+          <wp:cNvGraphicFramePr/>
+          <a:graphic xmlns:a="http://schemas.openxmlformats.org/drawingml/2006/main">
             <a:graphicData uri="http://schemas.openxmlformats.org/drawingml/2006/picture">
-              <pic:pic>
+              <pic:pic xmlns:pic="http://schemas.openxmlformats.org/drawingml/2006/picture">
                 <pic:nvPicPr>
-                  <pic:cNvPr descr="footer" id="0" name="image6.png"/>
+                  <pic:cNvPr id="0" name="image5.png" descr="footer"/>
                   <pic:cNvPicPr preferRelativeResize="0"/>
                 </pic:nvPicPr>
                 <pic:blipFill>
                   <a:blip r:embed="rId1"/>
-                  <a:srcRect b="1037" l="0" r="0" t="1037"/>
+                  <a:srcRect t="1037" b="1037"/>
                   <a:stretch>
                     <a:fillRect/>
                   </a:stretch>
@@ -671,7 +620,9 @@
                     <a:off x="0" y="0"/>
                     <a:ext cx="7781925" cy="409575"/>
                   </a:xfrm>
-                  <a:prstGeom prst="rect"/>
+                  <a:prstGeom prst="rect">
+                    <a:avLst/>
+                  </a:prstGeom>
                   <a:ln/>
                 </pic:spPr>
               </pic:pic>
@@ -684,37 +635,25 @@
 </w:ftr>
 </file>
 
-<file path=word/footer2.xml><?xml version="1.0" encoding="utf-8"?>
-<w:ftr xmlns:mc="http://schemas.openxmlformats.org/markup-compatibility/2006" xmlns:o="urn:schemas-microsoft-com:office:office" xmlns:r="http://schemas.openxmlformats.org/officeDocument/2006/relationships" xmlns:m="http://schemas.openxmlformats.org/officeDocument/2006/math" xmlns:v="urn:schemas-microsoft-com:vml" xmlns:wp="http://schemas.openxmlformats.org/drawingml/2006/wordprocessingDrawing" xmlns:w10="urn:schemas-microsoft-com:office:word" xmlns:w="http://schemas.openxmlformats.org/wordprocessingml/2006/main" xmlns:wne="http://schemas.microsoft.com/office/word/2006/wordml" xmlns:sl="http://schemas.openxmlformats.org/schemaLibrary/2006/main" xmlns:a="http://schemas.openxmlformats.org/drawingml/2006/main" xmlns:pic="http://schemas.openxmlformats.org/drawingml/2006/picture" xmlns:c="http://schemas.openxmlformats.org/drawingml/2006/chart" xmlns:lc="http://schemas.openxmlformats.org/drawingml/2006/lockedCanvas" xmlns:dgm="http://schemas.openxmlformats.org/drawingml/2006/diagram" xmlns:wps="http://schemas.microsoft.com/office/word/2010/wordprocessingShape" xmlns:wpg="http://schemas.microsoft.com/office/word/2010/wordprocessingGroup" xmlns:w14="http://schemas.microsoft.com/office/word/2010/wordml" xmlns:w15="http://schemas.microsoft.com/office/word/2012/wordml" xmlns:w16="http://schemas.microsoft.com/office/word/2018/wordml" xmlns:w16cex="http://schemas.microsoft.com/office/word/2018/wordml/cex" xmlns:w16cid="http://schemas.microsoft.com/office/word/2016/wordml/cid" xmlns="http://schemas.microsoft.com/office/tasks/2019/documenttasks" xmlns:cr="http://schemas.microsoft.com/office/comments/2020/reactions">
+<file path=word/footer3.xml><?xml version="1.0" encoding="utf-8"?>
+<w:ftr xmlns:wpc="http://schemas.microsoft.com/office/word/2010/wordprocessingCanvas" xmlns:cx="http://schemas.microsoft.com/office/drawing/2014/chartex" xmlns:cx1="http://schemas.microsoft.com/office/drawing/2015/9/8/chartex" xmlns:cx2="http://schemas.microsoft.com/office/drawing/2015/10/21/chartex" xmlns:cx3="http://schemas.microsoft.com/office/drawing/2016/5/9/chartex" xmlns:cx4="http://schemas.microsoft.com/office/drawing/2016/5/10/chartex" xmlns:cx5="http://schemas.microsoft.com/office/drawing/2016/5/11/chartex" xmlns:cx6="http://schemas.microsoft.com/office/drawing/2016/5/12/chartex" xmlns:cx7="http://schemas.microsoft.com/office/drawing/2016/5/13/chartex" xmlns:cx8="http://schemas.microsoft.com/office/drawing/2016/5/14/chartex" xmlns:mc="http://schemas.openxmlformats.org/markup-compatibility/2006" xmlns:aink="http://schemas.microsoft.com/office/drawing/2016/ink" xmlns:am3d="http://schemas.microsoft.com/office/drawing/2017/model3d" xmlns:o="urn:schemas-microsoft-com:office:office" xmlns:oel="http://schemas.microsoft.com/office/2019/extlst" xmlns:r="http://schemas.openxmlformats.org/officeDocument/2006/relationships" xmlns:m="http://schemas.openxmlformats.org/officeDocument/2006/math" xmlns:v="urn:schemas-microsoft-com:vml" xmlns:wp14="http://schemas.microsoft.com/office/word/2010/wordprocessingDrawing" xmlns:wp="http://schemas.openxmlformats.org/drawingml/2006/wordprocessingDrawing" xmlns:w10="urn:schemas-microsoft-com:office:word" xmlns:w="http://schemas.openxmlformats.org/wordprocessingml/2006/main" xmlns:w14="http://schemas.microsoft.com/office/word/2010/wordml" xmlns:w15="http://schemas.microsoft.com/office/word/2012/wordml" xmlns:w16cex="http://schemas.microsoft.com/office/word/2018/wordml/cex" xmlns:w16cid="http://schemas.microsoft.com/office/word/2016/wordml/cid" xmlns:w16="http://schemas.microsoft.com/office/word/2018/wordml" xmlns:w16du="http://schemas.microsoft.com/office/word/2023/wordml/word16du" xmlns:w16sdtdh="http://schemas.microsoft.com/office/word/2020/wordml/sdtdatahash" xmlns:w16sdtfl="http://schemas.microsoft.com/office/word/2024/wordml/sdtformatlock" xmlns:w16se="http://schemas.microsoft.com/office/word/2015/wordml/symex" xmlns:wpg="http://schemas.microsoft.com/office/word/2010/wordprocessingGroup" xmlns:wpi="http://schemas.microsoft.com/office/word/2010/wordprocessingInk" xmlns:wne="http://schemas.microsoft.com/office/word/2006/wordml" xmlns:wps="http://schemas.microsoft.com/office/word/2010/wordprocessingShape" mc:Ignorable="w14 w15 w16se w16cid w16 w16cex w16sdtdh w16sdtfl w16du wp14">
   <w:p>
     <w:pPr>
-      <w:pageBreakBefore w:val="0"/>
       <w:pBdr>
-        <w:top w:space="0" w:sz="0" w:val="nil"/>
-        <w:left w:space="0" w:sz="0" w:val="nil"/>
-        <w:bottom w:space="0" w:sz="0" w:val="nil"/>
-        <w:right w:space="0" w:sz="0" w:val="nil"/>
-        <w:between w:space="0" w:sz="0" w:val="nil"/>
+        <w:top w:val="nil"/>
+        <w:left w:val="nil"/>
+        <w:bottom w:val="nil"/>
+        <w:right w:val="nil"/>
+        <w:between w:val="nil"/>
       </w:pBdr>
-      <w:shd w:fill="auto" w:val="clear"/>
       <w:jc w:val="right"/>
-      <w:rPr/>
     </w:pPr>
     <w:r>
-      <w:rPr/>
-      <w:fldChar w:fldCharType="begin"/>
-      <w:instrText xml:space="preserve">PAGE</w:instrText>
-      <w:fldChar w:fldCharType="separate"/>
-      <w:fldChar w:fldCharType="end"/>
-    </w:r>
-    <w:r>
       <w:rPr>
-        <w:rtl w:val="0"/>
+        <w:noProof/>
       </w:rPr>
-    </w:r>
-    <w:r>
       <w:drawing>
-        <wp:anchor allowOverlap="1" behindDoc="0" distB="0" distT="0" distL="0" distR="0" hidden="0" layoutInCell="1" locked="0" relativeHeight="0" simplePos="0">
+        <wp:anchor distT="0" distB="0" distL="0" distR="0" simplePos="0" relativeHeight="251664384" behindDoc="0" locked="0" layoutInCell="1" hidden="0" allowOverlap="1" wp14:anchorId="4E70BDC0" wp14:editId="562C48E3">
           <wp:simplePos x="0" y="0"/>
           <wp:positionH relativeFrom="column">
             <wp:posOffset>-914399</wp:posOffset>
@@ -723,19 +662,20 @@
             <wp:posOffset>438150</wp:posOffset>
           </wp:positionV>
           <wp:extent cx="7781925" cy="409575"/>
-          <wp:effectExtent b="0" l="0" r="0" t="0"/>
-          <wp:wrapTopAndBottom distB="0" distT="0"/>
-          <wp:docPr descr="footer" id="1" name="image5.png"/>
-          <a:graphic>
+          <wp:effectExtent l="0" t="0" r="0" b="0"/>
+          <wp:wrapTopAndBottom distT="0" distB="0"/>
+          <wp:docPr id="2" name="image6.png" descr="footer"/>
+          <wp:cNvGraphicFramePr/>
+          <a:graphic xmlns:a="http://schemas.openxmlformats.org/drawingml/2006/main">
             <a:graphicData uri="http://schemas.openxmlformats.org/drawingml/2006/picture">
-              <pic:pic>
+              <pic:pic xmlns:pic="http://schemas.openxmlformats.org/drawingml/2006/picture">
                 <pic:nvPicPr>
-                  <pic:cNvPr descr="footer" id="0" name="image5.png"/>
+                  <pic:cNvPr id="0" name="image6.png" descr="footer"/>
                   <pic:cNvPicPr preferRelativeResize="0"/>
                 </pic:nvPicPr>
                 <pic:blipFill>
                   <a:blip r:embed="rId1"/>
-                  <a:srcRect b="1037" l="0" r="0" t="1037"/>
+                  <a:srcRect t="1037" b="1037"/>
                   <a:stretch>
                     <a:fillRect/>
                   </a:stretch>
@@ -745,7 +685,9 @@
                     <a:off x="0" y="0"/>
                     <a:ext cx="7781925" cy="409575"/>
                   </a:xfrm>
-                  <a:prstGeom prst="rect"/>
+                  <a:prstGeom prst="rect">
+                    <a:avLst/>
+                  </a:prstGeom>
                   <a:ln/>
                 </pic:spPr>
               </pic:pic>
@@ -758,22 +700,54 @@
 </w:ftr>
 </file>
 
+<file path=word/footnotes.xml><?xml version="1.0" encoding="utf-8"?>
+<w:footnotes xmlns:wpc="http://schemas.microsoft.com/office/word/2010/wordprocessingCanvas" xmlns:cx="http://schemas.microsoft.com/office/drawing/2014/chartex" xmlns:cx1="http://schemas.microsoft.com/office/drawing/2015/9/8/chartex" xmlns:cx2="http://schemas.microsoft.com/office/drawing/2015/10/21/chartex" xmlns:cx3="http://schemas.microsoft.com/office/drawing/2016/5/9/chartex" xmlns:cx4="http://schemas.microsoft.com/office/drawing/2016/5/10/chartex" xmlns:cx5="http://schemas.microsoft.com/office/drawing/2016/5/11/chartex" xmlns:cx6="http://schemas.microsoft.com/office/drawing/2016/5/12/chartex" xmlns:cx7="http://schemas.microsoft.com/office/drawing/2016/5/13/chartex" xmlns:cx8="http://schemas.microsoft.com/office/drawing/2016/5/14/chartex" xmlns:mc="http://schemas.openxmlformats.org/markup-compatibility/2006" xmlns:aink="http://schemas.microsoft.com/office/drawing/2016/ink" xmlns:am3d="http://schemas.microsoft.com/office/drawing/2017/model3d" xmlns:o="urn:schemas-microsoft-com:office:office" xmlns:oel="http://schemas.microsoft.com/office/2019/extlst" xmlns:r="http://schemas.openxmlformats.org/officeDocument/2006/relationships" xmlns:m="http://schemas.openxmlformats.org/officeDocument/2006/math" xmlns:v="urn:schemas-microsoft-com:vml" xmlns:wp14="http://schemas.microsoft.com/office/word/2010/wordprocessingDrawing" xmlns:wp="http://schemas.openxmlformats.org/drawingml/2006/wordprocessingDrawing" xmlns:w10="urn:schemas-microsoft-com:office:word" xmlns:w="http://schemas.openxmlformats.org/wordprocessingml/2006/main" xmlns:w14="http://schemas.microsoft.com/office/word/2010/wordml" xmlns:w15="http://schemas.microsoft.com/office/word/2012/wordml" xmlns:w16cex="http://schemas.microsoft.com/office/word/2018/wordml/cex" xmlns:w16cid="http://schemas.microsoft.com/office/word/2016/wordml/cid" xmlns:w16="http://schemas.microsoft.com/office/word/2018/wordml" xmlns:w16du="http://schemas.microsoft.com/office/word/2023/wordml/word16du" xmlns:w16sdtdh="http://schemas.microsoft.com/office/word/2020/wordml/sdtdatahash" xmlns:w16sdtfl="http://schemas.microsoft.com/office/word/2024/wordml/sdtformatlock" xmlns:w16se="http://schemas.microsoft.com/office/word/2015/wordml/symex" xmlns:wpg="http://schemas.microsoft.com/office/word/2010/wordprocessingGroup" xmlns:wpi="http://schemas.microsoft.com/office/word/2010/wordprocessingInk" xmlns:wne="http://schemas.microsoft.com/office/word/2006/wordml" xmlns:wps="http://schemas.microsoft.com/office/word/2010/wordprocessingShape" mc:Ignorable="w14 w15 w16se w16cid w16 w16cex w16sdtdh w16sdtfl w16du wp14">
+  <w:footnote w:type="separator" w:id="-1">
+    <w:p>
+      <w:pPr>
+        <w:spacing w:before="0" w:line="240" w:lineRule="auto"/>
+      </w:pPr>
+      <w:r>
+        <w:separator/>
+      </w:r>
+    </w:p>
+  </w:footnote>
+  <w:footnote w:type="continuationSeparator" w:id="0">
+    <w:p>
+      <w:pPr>
+        <w:spacing w:before="0" w:line="240" w:lineRule="auto"/>
+      </w:pPr>
+      <w:r>
+        <w:continuationSeparator/>
+      </w:r>
+    </w:p>
+  </w:footnote>
+</w:footnotes>
+</file>
+
 <file path=word/header1.xml><?xml version="1.0" encoding="utf-8"?>
-<w:hdr xmlns:mc="http://schemas.openxmlformats.org/markup-compatibility/2006" xmlns:o="urn:schemas-microsoft-com:office:office" xmlns:r="http://schemas.openxmlformats.org/officeDocument/2006/relationships" xmlns:m="http://schemas.openxmlformats.org/officeDocument/2006/math" xmlns:v="urn:schemas-microsoft-com:vml" xmlns:wp="http://schemas.openxmlformats.org/drawingml/2006/wordprocessingDrawing" xmlns:w10="urn:schemas-microsoft-com:office:word" xmlns:w="http://schemas.openxmlformats.org/wordprocessingml/2006/main" xmlns:wne="http://schemas.microsoft.com/office/word/2006/wordml" xmlns:sl="http://schemas.openxmlformats.org/schemaLibrary/2006/main" xmlns:a="http://schemas.openxmlformats.org/drawingml/2006/main" xmlns:pic="http://schemas.openxmlformats.org/drawingml/2006/picture" xmlns:c="http://schemas.openxmlformats.org/drawingml/2006/chart" xmlns:lc="http://schemas.openxmlformats.org/drawingml/2006/lockedCanvas" xmlns:dgm="http://schemas.openxmlformats.org/drawingml/2006/diagram" xmlns:wps="http://schemas.microsoft.com/office/word/2010/wordprocessingShape" xmlns:wpg="http://schemas.microsoft.com/office/word/2010/wordprocessingGroup" xmlns:w14="http://schemas.microsoft.com/office/word/2010/wordml" xmlns:w15="http://schemas.microsoft.com/office/word/2012/wordml" xmlns:w16="http://schemas.microsoft.com/office/word/2018/wordml" xmlns:w16cex="http://schemas.microsoft.com/office/word/2018/wordml/cex" xmlns:w16cid="http://schemas.microsoft.com/office/word/2016/wordml/cid" xmlns="http://schemas.microsoft.com/office/tasks/2019/documenttasks" xmlns:cr="http://schemas.microsoft.com/office/comments/2020/reactions">
+<w:hdr xmlns:wpc="http://schemas.microsoft.com/office/word/2010/wordprocessingCanvas" xmlns:cx="http://schemas.microsoft.com/office/drawing/2014/chartex" xmlns:cx1="http://schemas.microsoft.com/office/drawing/2015/9/8/chartex" xmlns:cx2="http://schemas.microsoft.com/office/drawing/2015/10/21/chartex" xmlns:cx3="http://schemas.microsoft.com/office/drawing/2016/5/9/chartex" xmlns:cx4="http://schemas.microsoft.com/office/drawing/2016/5/10/chartex" xmlns:cx5="http://schemas.microsoft.com/office/drawing/2016/5/11/chartex" xmlns:cx6="http://schemas.microsoft.com/office/drawing/2016/5/12/chartex" xmlns:cx7="http://schemas.microsoft.com/office/drawing/2016/5/13/chartex" xmlns:cx8="http://schemas.microsoft.com/office/drawing/2016/5/14/chartex" xmlns:mc="http://schemas.openxmlformats.org/markup-compatibility/2006" xmlns:aink="http://schemas.microsoft.com/office/drawing/2016/ink" xmlns:am3d="http://schemas.microsoft.com/office/drawing/2017/model3d" xmlns:o="urn:schemas-microsoft-com:office:office" xmlns:oel="http://schemas.microsoft.com/office/2019/extlst" xmlns:r="http://schemas.openxmlformats.org/officeDocument/2006/relationships" xmlns:m="http://schemas.openxmlformats.org/officeDocument/2006/math" xmlns:v="urn:schemas-microsoft-com:vml" xmlns:wp14="http://schemas.microsoft.com/office/word/2010/wordprocessingDrawing" xmlns:wp="http://schemas.openxmlformats.org/drawingml/2006/wordprocessingDrawing" xmlns:w10="urn:schemas-microsoft-com:office:word" xmlns:w="http://schemas.openxmlformats.org/wordprocessingml/2006/main" xmlns:w14="http://schemas.microsoft.com/office/word/2010/wordml" xmlns:w15="http://schemas.microsoft.com/office/word/2012/wordml" xmlns:w16cex="http://schemas.microsoft.com/office/word/2018/wordml/cex" xmlns:w16cid="http://schemas.microsoft.com/office/word/2016/wordml/cid" xmlns:w16="http://schemas.microsoft.com/office/word/2018/wordml" xmlns:w16du="http://schemas.microsoft.com/office/word/2023/wordml/word16du" xmlns:w16sdtdh="http://schemas.microsoft.com/office/word/2020/wordml/sdtdatahash" xmlns:w16sdtfl="http://schemas.microsoft.com/office/word/2024/wordml/sdtformatlock" xmlns:w16se="http://schemas.microsoft.com/office/word/2015/wordml/symex" xmlns:wpg="http://schemas.microsoft.com/office/word/2010/wordprocessingGroup" xmlns:wpi="http://schemas.microsoft.com/office/word/2010/wordprocessingInk" xmlns:wne="http://schemas.microsoft.com/office/word/2006/wordml" xmlns:wps="http://schemas.microsoft.com/office/word/2010/wordprocessingShape" mc:Ignorable="w14 w15 w16se w16cid w16 w16cex w16sdtdh w16sdtfl w16du wp14">
   <w:p>
     <w:pPr>
-      <w:pageBreakBefore w:val="0"/>
+      <w:pStyle w:val="Header"/>
+    </w:pPr>
+  </w:p>
+</w:hdr>
+</file>
+
+<file path=word/header2.xml><?xml version="1.0" encoding="utf-8"?>
+<w:hdr xmlns:wpc="http://schemas.microsoft.com/office/word/2010/wordprocessingCanvas" xmlns:cx="http://schemas.microsoft.com/office/drawing/2014/chartex" xmlns:cx1="http://schemas.microsoft.com/office/drawing/2015/9/8/chartex" xmlns:cx2="http://schemas.microsoft.com/office/drawing/2015/10/21/chartex" xmlns:cx3="http://schemas.microsoft.com/office/drawing/2016/5/9/chartex" xmlns:cx4="http://schemas.microsoft.com/office/drawing/2016/5/10/chartex" xmlns:cx5="http://schemas.microsoft.com/office/drawing/2016/5/11/chartex" xmlns:cx6="http://schemas.microsoft.com/office/drawing/2016/5/12/chartex" xmlns:cx7="http://schemas.microsoft.com/office/drawing/2016/5/13/chartex" xmlns:cx8="http://schemas.microsoft.com/office/drawing/2016/5/14/chartex" xmlns:mc="http://schemas.openxmlformats.org/markup-compatibility/2006" xmlns:aink="http://schemas.microsoft.com/office/drawing/2016/ink" xmlns:am3d="http://schemas.microsoft.com/office/drawing/2017/model3d" xmlns:o="urn:schemas-microsoft-com:office:office" xmlns:oel="http://schemas.microsoft.com/office/2019/extlst" xmlns:r="http://schemas.openxmlformats.org/officeDocument/2006/relationships" xmlns:m="http://schemas.openxmlformats.org/officeDocument/2006/math" xmlns:v="urn:schemas-microsoft-com:vml" xmlns:wp14="http://schemas.microsoft.com/office/word/2010/wordprocessingDrawing" xmlns:wp="http://schemas.openxmlformats.org/drawingml/2006/wordprocessingDrawing" xmlns:w10="urn:schemas-microsoft-com:office:word" xmlns:w="http://schemas.openxmlformats.org/wordprocessingml/2006/main" xmlns:w14="http://schemas.microsoft.com/office/word/2010/wordml" xmlns:w15="http://schemas.microsoft.com/office/word/2012/wordml" xmlns:w16cex="http://schemas.microsoft.com/office/word/2018/wordml/cex" xmlns:w16cid="http://schemas.microsoft.com/office/word/2016/wordml/cid" xmlns:w16="http://schemas.microsoft.com/office/word/2018/wordml" xmlns:w16du="http://schemas.microsoft.com/office/word/2023/wordml/word16du" xmlns:w16sdtdh="http://schemas.microsoft.com/office/word/2020/wordml/sdtdatahash" xmlns:w16sdtfl="http://schemas.microsoft.com/office/word/2024/wordml/sdtformatlock" xmlns:w16se="http://schemas.microsoft.com/office/word/2015/wordml/symex" xmlns:wpg="http://schemas.microsoft.com/office/word/2010/wordprocessingGroup" xmlns:wpi="http://schemas.microsoft.com/office/word/2010/wordprocessingInk" xmlns:wne="http://schemas.microsoft.com/office/word/2006/wordml" xmlns:wps="http://schemas.microsoft.com/office/word/2010/wordprocessingShape" mc:Ignorable="w14 w15 w16se w16cid w16 w16cex w16sdtdh w16sdtfl w16du wp14">
+  <w:p>
+    <w:pPr>
       <w:pBdr>
-        <w:top w:space="0" w:sz="0" w:val="nil"/>
-        <w:left w:space="0" w:sz="0" w:val="nil"/>
-        <w:bottom w:space="0" w:sz="0" w:val="nil"/>
-        <w:right w:space="0" w:sz="0" w:val="nil"/>
-        <w:between w:space="0" w:sz="0" w:val="nil"/>
+        <w:top w:val="nil"/>
+        <w:left w:val="nil"/>
+        <w:bottom w:val="nil"/>
+        <w:right w:val="nil"/>
+        <w:between w:val="nil"/>
       </w:pBdr>
-      <w:shd w:fill="auto" w:val="clear"/>
-      <w:spacing w:before="640" w:line="300" w:lineRule="auto"/>
+      <w:spacing w:before="640"/>
       <w:rPr>
-        <w:rFonts w:ascii="Proxima Nova" w:cs="Proxima Nova" w:eastAsia="Proxima Nova" w:hAnsi="Proxima Nova"/>
         <w:color w:val="666666"/>
         <w:sz w:val="20"/>
         <w:szCs w:val="20"/>
@@ -781,12 +755,13 @@
     </w:pPr>
     <w:r>
       <w:rPr>
+        <w:noProof/>
         <w:color w:val="666666"/>
         <w:sz w:val="20"/>
         <w:szCs w:val="20"/>
       </w:rPr>
       <w:drawing>
-        <wp:anchor allowOverlap="1" behindDoc="1" distB="114300" distT="114300" distL="114300" distR="114300" hidden="0" layoutInCell="1" locked="0" relativeHeight="0" simplePos="0">
+        <wp:anchor distT="114300" distB="114300" distL="114300" distR="114300" simplePos="0" relativeHeight="251658240" behindDoc="1" locked="0" layoutInCell="1" hidden="0" allowOverlap="1" wp14:anchorId="6574655F" wp14:editId="3D61E8C5">
           <wp:simplePos x="0" y="0"/>
           <wp:positionH relativeFrom="page">
             <wp:posOffset>449580</wp:posOffset>
@@ -795,19 +770,20 @@
             <wp:posOffset>317500</wp:posOffset>
           </wp:positionV>
           <wp:extent cx="1984248" cy="283464"/>
-          <wp:effectExtent b="0" l="0" r="0" t="0"/>
+          <wp:effectExtent l="0" t="0" r="0" b="0"/>
           <wp:wrapNone/>
           <wp:docPr id="3" name="image2.png"/>
-          <a:graphic>
+          <wp:cNvGraphicFramePr/>
+          <a:graphic xmlns:a="http://schemas.openxmlformats.org/drawingml/2006/main">
             <a:graphicData uri="http://schemas.openxmlformats.org/drawingml/2006/picture">
-              <pic:pic>
+              <pic:pic xmlns:pic="http://schemas.openxmlformats.org/drawingml/2006/picture">
                 <pic:nvPicPr>
                   <pic:cNvPr id="0" name="image2.png"/>
                   <pic:cNvPicPr preferRelativeResize="0"/>
                 </pic:nvPicPr>
                 <pic:blipFill>
                   <a:blip r:embed="rId1"/>
-                  <a:srcRect b="0" l="0" r="0" t="0"/>
+                  <a:srcRect/>
                   <a:stretch>
                     <a:fillRect/>
                   </a:stretch>
@@ -817,7 +793,9 @@
                     <a:off x="0" y="0"/>
                     <a:ext cx="1984248" cy="283464"/>
                   </a:xfrm>
-                  <a:prstGeom prst="rect"/>
+                  <a:prstGeom prst="rect">
+                    <a:avLst/>
+                  </a:prstGeom>
                   <a:ln/>
                 </pic:spPr>
               </pic:pic>
@@ -828,12 +806,10 @@
     </w:r>
     <w:r>
       <w:rPr>
-        <w:rtl w:val="0"/>
+        <w:noProof/>
       </w:rPr>
-    </w:r>
-    <w:r>
       <w:drawing>
-        <wp:anchor allowOverlap="1" behindDoc="0" distB="0" distT="0" distL="0" distR="0" hidden="0" layoutInCell="1" locked="0" relativeHeight="0" simplePos="0">
+        <wp:anchor distT="0" distB="0" distL="0" distR="0" simplePos="0" relativeHeight="251659264" behindDoc="0" locked="0" layoutInCell="1" hidden="0" allowOverlap="1" wp14:anchorId="702B9FAF" wp14:editId="5499FFC6">
           <wp:simplePos x="0" y="0"/>
           <wp:positionH relativeFrom="column">
             <wp:posOffset>-914399</wp:posOffset>
@@ -842,19 +818,20 @@
             <wp:posOffset>-66674</wp:posOffset>
           </wp:positionV>
           <wp:extent cx="7781925" cy="95250"/>
-          <wp:effectExtent b="0" l="0" r="0" t="0"/>
-          <wp:wrapTopAndBottom distB="0" distT="0"/>
-          <wp:docPr descr="horizontal line" id="4" name="image1.png"/>
-          <a:graphic>
+          <wp:effectExtent l="0" t="0" r="0" b="0"/>
+          <wp:wrapTopAndBottom distT="0" distB="0"/>
+          <wp:docPr id="4" name="image1.png" descr="horizontal line"/>
+          <wp:cNvGraphicFramePr/>
+          <a:graphic xmlns:a="http://schemas.openxmlformats.org/drawingml/2006/main">
             <a:graphicData uri="http://schemas.openxmlformats.org/drawingml/2006/picture">
-              <pic:pic>
+              <pic:pic xmlns:pic="http://schemas.openxmlformats.org/drawingml/2006/picture">
                 <pic:nvPicPr>
-                  <pic:cNvPr descr="horizontal line" id="0" name="image1.png"/>
+                  <pic:cNvPr id="0" name="image1.png" descr="horizontal line"/>
                   <pic:cNvPicPr preferRelativeResize="0"/>
                 </pic:nvPicPr>
                 <pic:blipFill>
                   <a:blip r:embed="rId2"/>
-                  <a:srcRect b="0" l="0" r="0" t="0"/>
+                  <a:srcRect/>
                   <a:stretch>
                     <a:fillRect/>
                   </a:stretch>
@@ -864,7 +841,9 @@
                     <a:off x="0" y="0"/>
                     <a:ext cx="7781925" cy="95250"/>
                   </a:xfrm>
-                  <a:prstGeom prst="rect"/>
+                  <a:prstGeom prst="rect">
+                    <a:avLst/>
+                  </a:prstGeom>
                   <a:ln/>
                 </pic:spPr>
               </pic:pic>
@@ -874,8 +853,11 @@
       </w:drawing>
     </w:r>
     <w:r>
+      <w:rPr>
+        <w:noProof/>
+      </w:rPr>
       <w:drawing>
-        <wp:anchor allowOverlap="1" behindDoc="0" distB="0" distT="0" distL="0" distR="0" hidden="0" layoutInCell="1" locked="0" relativeHeight="0" simplePos="0">
+        <wp:anchor distT="0" distB="0" distL="0" distR="0" simplePos="0" relativeHeight="251660288" behindDoc="0" locked="0" layoutInCell="1" hidden="0" allowOverlap="1" wp14:anchorId="32F62ADE" wp14:editId="28D75B9E">
           <wp:simplePos x="0" y="0"/>
           <wp:positionH relativeFrom="column">
             <wp:posOffset>-919162</wp:posOffset>
@@ -884,19 +866,20 @@
             <wp:posOffset>-66674</wp:posOffset>
           </wp:positionV>
           <wp:extent cx="7781925" cy="95250"/>
-          <wp:effectExtent b="0" l="0" r="0" t="0"/>
-          <wp:wrapTopAndBottom distB="0" distT="0"/>
-          <wp:docPr descr="horizontal line" id="7" name="image3.png"/>
-          <a:graphic>
+          <wp:effectExtent l="0" t="0" r="0" b="0"/>
+          <wp:wrapTopAndBottom distT="0" distB="0"/>
+          <wp:docPr id="7" name="image3.png" descr="horizontal line"/>
+          <wp:cNvGraphicFramePr/>
+          <a:graphic xmlns:a="http://schemas.openxmlformats.org/drawingml/2006/main">
             <a:graphicData uri="http://schemas.openxmlformats.org/drawingml/2006/picture">
-              <pic:pic>
+              <pic:pic xmlns:pic="http://schemas.openxmlformats.org/drawingml/2006/picture">
                 <pic:nvPicPr>
-                  <pic:cNvPr descr="horizontal line" id="0" name="image3.png"/>
+                  <pic:cNvPr id="0" name="image3.png" descr="horizontal line"/>
                   <pic:cNvPicPr preferRelativeResize="0"/>
                 </pic:nvPicPr>
                 <pic:blipFill>
                   <a:blip r:embed="rId3"/>
-                  <a:srcRect b="3029" l="0" r="0" t="3029"/>
+                  <a:srcRect t="3029" b="3029"/>
                   <a:stretch>
                     <a:fillRect/>
                   </a:stretch>
@@ -906,7 +889,9 @@
                     <a:off x="0" y="0"/>
                     <a:ext cx="7781925" cy="95250"/>
                   </a:xfrm>
-                  <a:prstGeom prst="rect"/>
+                  <a:prstGeom prst="rect">
+                    <a:avLst/>
+                  </a:prstGeom>
                   <a:ln/>
                 </pic:spPr>
               </pic:pic>
@@ -918,18 +903,14 @@
   </w:p>
   <w:p>
     <w:pPr>
-      <w:pageBreakBefore w:val="0"/>
       <w:pBdr>
-        <w:top w:space="0" w:sz="0" w:val="nil"/>
-        <w:left w:space="0" w:sz="0" w:val="nil"/>
-        <w:bottom w:space="0" w:sz="0" w:val="nil"/>
-        <w:right w:space="0" w:sz="0" w:val="nil"/>
-        <w:between w:space="0" w:sz="0" w:val="nil"/>
+        <w:top w:val="nil"/>
+        <w:left w:val="nil"/>
+        <w:bottom w:val="nil"/>
+        <w:right w:val="nil"/>
+        <w:between w:val="nil"/>
       </w:pBdr>
-      <w:shd w:fill="auto" w:val="clear"/>
-      <w:spacing w:line="300" w:lineRule="auto"/>
       <w:rPr>
-        <w:rFonts w:ascii="Proxima Nova" w:cs="Proxima Nova" w:eastAsia="Proxima Nova" w:hAnsi="Proxima Nova"/>
         <w:color w:val="666666"/>
         <w:sz w:val="20"/>
         <w:szCs w:val="20"/>
@@ -937,25 +918,27 @@
     </w:pPr>
     <w:r>
       <w:rPr>
+        <w:noProof/>
         <w:color w:val="666666"/>
         <w:sz w:val="20"/>
         <w:szCs w:val="20"/>
       </w:rPr>
       <w:drawing>
-        <wp:inline distB="0" distT="0" distL="0" distR="0">
+        <wp:inline distT="0" distB="0" distL="0" distR="0" wp14:anchorId="68E2957C" wp14:editId="578DB520">
           <wp:extent cx="448056" cy="54864"/>
-          <wp:effectExtent b="0" l="0" r="0" t="0"/>
-          <wp:docPr descr="footer" id="6" name="image6.png"/>
-          <a:graphic>
+          <wp:effectExtent l="0" t="0" r="0" b="0"/>
+          <wp:docPr id="6" name="image6.png" descr="footer"/>
+          <wp:cNvGraphicFramePr/>
+          <a:graphic xmlns:a="http://schemas.openxmlformats.org/drawingml/2006/main">
             <a:graphicData uri="http://schemas.openxmlformats.org/drawingml/2006/picture">
-              <pic:pic>
+              <pic:pic xmlns:pic="http://schemas.openxmlformats.org/drawingml/2006/picture">
                 <pic:nvPicPr>
-                  <pic:cNvPr descr="footer" id="0" name="image6.png"/>
+                  <pic:cNvPr id="0" name="image6.png" descr="footer"/>
                   <pic:cNvPicPr preferRelativeResize="0"/>
                 </pic:nvPicPr>
                 <pic:blipFill>
                   <a:blip r:embed="rId4"/>
-                  <a:srcRect b="1037" l="0" r="0" t="1037"/>
+                  <a:srcRect t="1037" b="1037"/>
                   <a:stretch>
                     <a:fillRect/>
                   </a:stretch>
@@ -965,7 +948,9 @@
                     <a:off x="0" y="0"/>
                     <a:ext cx="448056" cy="54864"/>
                   </a:xfrm>
-                  <a:prstGeom prst="rect"/>
+                  <a:prstGeom prst="rect">
+                    <a:avLst/>
+                  </a:prstGeom>
                   <a:ln/>
                 </pic:spPr>
               </pic:pic>
@@ -974,31 +959,27 @@
         </wp:inline>
       </w:drawing>
     </w:r>
-    <w:r>
-      <w:rPr>
-        <w:rtl w:val="0"/>
-      </w:rPr>
-    </w:r>
   </w:p>
 </w:hdr>
 </file>
 
-<file path=word/header2.xml><?xml version="1.0" encoding="utf-8"?>
-<w:hdr xmlns:mc="http://schemas.openxmlformats.org/markup-compatibility/2006" xmlns:o="urn:schemas-microsoft-com:office:office" xmlns:r="http://schemas.openxmlformats.org/officeDocument/2006/relationships" xmlns:m="http://schemas.openxmlformats.org/officeDocument/2006/math" xmlns:v="urn:schemas-microsoft-com:vml" xmlns:wp="http://schemas.openxmlformats.org/drawingml/2006/wordprocessingDrawing" xmlns:w10="urn:schemas-microsoft-com:office:word" xmlns:w="http://schemas.openxmlformats.org/wordprocessingml/2006/main" xmlns:wne="http://schemas.microsoft.com/office/word/2006/wordml" xmlns:sl="http://schemas.openxmlformats.org/schemaLibrary/2006/main" xmlns:a="http://schemas.openxmlformats.org/drawingml/2006/main" xmlns:pic="http://schemas.openxmlformats.org/drawingml/2006/picture" xmlns:c="http://schemas.openxmlformats.org/drawingml/2006/chart" xmlns:lc="http://schemas.openxmlformats.org/drawingml/2006/lockedCanvas" xmlns:dgm="http://schemas.openxmlformats.org/drawingml/2006/diagram" xmlns:wps="http://schemas.microsoft.com/office/word/2010/wordprocessingShape" xmlns:wpg="http://schemas.microsoft.com/office/word/2010/wordprocessingGroup" xmlns:w14="http://schemas.microsoft.com/office/word/2010/wordml" xmlns:w15="http://schemas.microsoft.com/office/word/2012/wordml" xmlns:w16="http://schemas.microsoft.com/office/word/2018/wordml" xmlns:w16cex="http://schemas.microsoft.com/office/word/2018/wordml/cex" xmlns:w16cid="http://schemas.microsoft.com/office/word/2016/wordml/cid" xmlns="http://schemas.microsoft.com/office/tasks/2019/documenttasks" xmlns:cr="http://schemas.microsoft.com/office/comments/2020/reactions">
+<file path=word/header3.xml><?xml version="1.0" encoding="utf-8"?>
+<w:hdr xmlns:wpc="http://schemas.microsoft.com/office/word/2010/wordprocessingCanvas" xmlns:cx="http://schemas.microsoft.com/office/drawing/2014/chartex" xmlns:cx1="http://schemas.microsoft.com/office/drawing/2015/9/8/chartex" xmlns:cx2="http://schemas.microsoft.com/office/drawing/2015/10/21/chartex" xmlns:cx3="http://schemas.microsoft.com/office/drawing/2016/5/9/chartex" xmlns:cx4="http://schemas.microsoft.com/office/drawing/2016/5/10/chartex" xmlns:cx5="http://schemas.microsoft.com/office/drawing/2016/5/11/chartex" xmlns:cx6="http://schemas.microsoft.com/office/drawing/2016/5/12/chartex" xmlns:cx7="http://schemas.microsoft.com/office/drawing/2016/5/13/chartex" xmlns:cx8="http://schemas.microsoft.com/office/drawing/2016/5/14/chartex" xmlns:mc="http://schemas.openxmlformats.org/markup-compatibility/2006" xmlns:aink="http://schemas.microsoft.com/office/drawing/2016/ink" xmlns:am3d="http://schemas.microsoft.com/office/drawing/2017/model3d" xmlns:o="urn:schemas-microsoft-com:office:office" xmlns:oel="http://schemas.microsoft.com/office/2019/extlst" xmlns:r="http://schemas.openxmlformats.org/officeDocument/2006/relationships" xmlns:m="http://schemas.openxmlformats.org/officeDocument/2006/math" xmlns:v="urn:schemas-microsoft-com:vml" xmlns:wp14="http://schemas.microsoft.com/office/word/2010/wordprocessingDrawing" xmlns:wp="http://schemas.openxmlformats.org/drawingml/2006/wordprocessingDrawing" xmlns:w10="urn:schemas-microsoft-com:office:word" xmlns:w="http://schemas.openxmlformats.org/wordprocessingml/2006/main" xmlns:w14="http://schemas.microsoft.com/office/word/2010/wordml" xmlns:w15="http://schemas.microsoft.com/office/word/2012/wordml" xmlns:w16cex="http://schemas.microsoft.com/office/word/2018/wordml/cex" xmlns:w16cid="http://schemas.microsoft.com/office/word/2016/wordml/cid" xmlns:w16="http://schemas.microsoft.com/office/word/2018/wordml" xmlns:w16du="http://schemas.microsoft.com/office/word/2023/wordml/word16du" xmlns:w16sdtdh="http://schemas.microsoft.com/office/word/2020/wordml/sdtdatahash" xmlns:w16sdtfl="http://schemas.microsoft.com/office/word/2024/wordml/sdtformatlock" xmlns:w16se="http://schemas.microsoft.com/office/word/2015/wordml/symex" xmlns:wpg="http://schemas.microsoft.com/office/word/2010/wordprocessingGroup" xmlns:wpi="http://schemas.microsoft.com/office/word/2010/wordprocessingInk" xmlns:wne="http://schemas.microsoft.com/office/word/2006/wordml" xmlns:wps="http://schemas.microsoft.com/office/word/2010/wordprocessingShape" mc:Ignorable="w14 w15 w16se w16cid w16 w16cex w16sdtdh w16sdtfl w16du wp14">
   <w:p>
     <w:pPr>
       <w:spacing w:before="0" w:line="276" w:lineRule="auto"/>
-      <w:ind w:left="-720" w:firstLine="0"/>
+      <w:ind w:left="-720"/>
       <w:rPr>
-        <w:rFonts w:ascii="Arial" w:cs="Arial" w:eastAsia="Arial" w:hAnsi="Arial"/>
+        <w:rFonts w:ascii="Arial" w:eastAsia="Arial" w:hAnsi="Arial" w:cs="Arial"/>
       </w:rPr>
     </w:pPr>
     <w:r>
       <w:rPr>
-        <w:rFonts w:ascii="Arial" w:cs="Arial" w:eastAsia="Arial" w:hAnsi="Arial"/>
+        <w:rFonts w:ascii="Arial" w:eastAsia="Arial" w:hAnsi="Arial" w:cs="Arial"/>
+        <w:noProof/>
       </w:rPr>
       <w:drawing>
-        <wp:anchor allowOverlap="1" behindDoc="1" distB="114300" distT="114300" distL="114300" distR="114300" hidden="0" layoutInCell="1" locked="0" relativeHeight="0" simplePos="0">
+        <wp:anchor distT="114300" distB="114300" distL="114300" distR="114300" simplePos="0" relativeHeight="251661312" behindDoc="1" locked="0" layoutInCell="1" hidden="0" allowOverlap="1" wp14:anchorId="479B17F5" wp14:editId="23F2FA3B">
           <wp:simplePos x="0" y="0"/>
           <wp:positionH relativeFrom="page">
             <wp:posOffset>449580</wp:posOffset>
@@ -1007,19 +988,20 @@
             <wp:posOffset>253365</wp:posOffset>
           </wp:positionV>
           <wp:extent cx="1984248" cy="283464"/>
-          <wp:effectExtent b="0" l="0" r="0" t="0"/>
+          <wp:effectExtent l="0" t="0" r="0" b="0"/>
           <wp:wrapNone/>
           <wp:docPr id="5" name="image2.png"/>
-          <a:graphic>
+          <wp:cNvGraphicFramePr/>
+          <a:graphic xmlns:a="http://schemas.openxmlformats.org/drawingml/2006/main">
             <a:graphicData uri="http://schemas.openxmlformats.org/drawingml/2006/picture">
-              <pic:pic>
+              <pic:pic xmlns:pic="http://schemas.openxmlformats.org/drawingml/2006/picture">
                 <pic:nvPicPr>
                   <pic:cNvPr id="0" name="image2.png"/>
                   <pic:cNvPicPr preferRelativeResize="0"/>
                 </pic:nvPicPr>
                 <pic:blipFill>
                   <a:blip r:embed="rId1"/>
-                  <a:srcRect b="0" l="0" r="0" t="0"/>
+                  <a:srcRect/>
                   <a:stretch>
                     <a:fillRect/>
                   </a:stretch>
@@ -1029,7 +1011,9 @@
                     <a:off x="0" y="0"/>
                     <a:ext cx="1984248" cy="283464"/>
                   </a:xfrm>
-                  <a:prstGeom prst="rect"/>
+                  <a:prstGeom prst="rect">
+                    <a:avLst/>
+                  </a:prstGeom>
                   <a:ln/>
                 </pic:spPr>
               </pic:pic>
@@ -1040,12 +1024,10 @@
     </w:r>
     <w:r>
       <w:rPr>
-        <w:rtl w:val="0"/>
+        <w:noProof/>
       </w:rPr>
-    </w:r>
-    <w:r>
       <w:drawing>
-        <wp:anchor allowOverlap="1" behindDoc="0" distB="0" distT="0" distL="0" distR="0" hidden="0" layoutInCell="1" locked="0" relativeHeight="0" simplePos="0">
+        <wp:anchor distT="0" distB="0" distL="0" distR="0" simplePos="0" relativeHeight="251662336" behindDoc="0" locked="0" layoutInCell="1" hidden="0" allowOverlap="1" wp14:anchorId="3B767650" wp14:editId="4AA59C79">
           <wp:simplePos x="0" y="0"/>
           <wp:positionH relativeFrom="column">
             <wp:posOffset>-919162</wp:posOffset>
@@ -1054,19 +1036,20 @@
             <wp:posOffset>-66674</wp:posOffset>
           </wp:positionV>
           <wp:extent cx="7781925" cy="95250"/>
-          <wp:effectExtent b="0" l="0" r="0" t="0"/>
-          <wp:wrapTopAndBottom distB="0" distT="0"/>
-          <wp:docPr descr="horizontal line" id="9" name="image4.png"/>
-          <a:graphic>
+          <wp:effectExtent l="0" t="0" r="0" b="0"/>
+          <wp:wrapTopAndBottom distT="0" distB="0"/>
+          <wp:docPr id="9" name="image4.png" descr="horizontal line"/>
+          <wp:cNvGraphicFramePr/>
+          <a:graphic xmlns:a="http://schemas.openxmlformats.org/drawingml/2006/main">
             <a:graphicData uri="http://schemas.openxmlformats.org/drawingml/2006/picture">
-              <pic:pic>
+              <pic:pic xmlns:pic="http://schemas.openxmlformats.org/drawingml/2006/picture">
                 <pic:nvPicPr>
-                  <pic:cNvPr descr="horizontal line" id="0" name="image4.png"/>
+                  <pic:cNvPr id="0" name="image4.png" descr="horizontal line"/>
                   <pic:cNvPicPr preferRelativeResize="0"/>
                 </pic:nvPicPr>
                 <pic:blipFill>
                   <a:blip r:embed="rId2"/>
-                  <a:srcRect b="3029" l="0" r="0" t="3029"/>
+                  <a:srcRect t="3029" b="3029"/>
                   <a:stretch>
                     <a:fillRect/>
                   </a:stretch>
@@ -1076,7 +1059,9 @@
                     <a:off x="0" y="0"/>
                     <a:ext cx="7781925" cy="95250"/>
                   </a:xfrm>
-                  <a:prstGeom prst="rect"/>
+                  <a:prstGeom prst="rect">
+                    <a:avLst/>
+                  </a:prstGeom>
                   <a:ln/>
                 </pic:spPr>
               </pic:pic>
@@ -1086,63 +1071,15 @@
       </w:drawing>
     </w:r>
   </w:p>
-  <w:p>
-    <w:pPr>
-      <w:spacing w:before="0" w:line="276" w:lineRule="auto"/>
-      <w:ind w:left="720" w:firstLine="720"/>
-      <w:jc w:val="right"/>
-      <w:rPr/>
-    </w:pPr>
-    <w:r>
-      <w:rPr>
-        <w:rFonts w:ascii="Arial" w:cs="Arial" w:eastAsia="Arial" w:hAnsi="Arial"/>
-        <w:b w:val="1"/>
-        <w:bCs w:val="1"/>
-        <w:color w:val="ff0000"/>
-        <w:sz w:val="26"/>
-        <w:szCs w:val="26"/>
-        <w:rtl w:val="0"/>
-      </w:rPr>
-      <w:t xml:space="preserve"> </w:t>
-    </w:r>
-    <w:r>
-      <w:rPr>
-        <w:rFonts w:ascii="Arial" w:cs="Arial" w:eastAsia="Arial" w:hAnsi="Arial"/>
-        <w:b w:val="1"/>
-        <w:bCs w:val="1"/>
-        <w:i w:val="1"/>
-        <w:iCs w:val="1"/>
-        <w:color w:val="ff0000"/>
-        <w:sz w:val="24"/>
-        <w:szCs w:val="24"/>
-        <w:rtl w:val="0"/>
-      </w:rPr>
-      <w:t xml:space="preserve">TEMPLATE:</w:t>
-    </w:r>
-    <w:r>
-      <w:rPr>
-        <w:rFonts w:ascii="Arial" w:cs="Arial" w:eastAsia="Arial" w:hAnsi="Arial"/>
-        <w:i w:val="1"/>
-        <w:iCs w:val="1"/>
-        <w:color w:val="ff0000"/>
-        <w:sz w:val="24"/>
-        <w:szCs w:val="24"/>
-        <w:rtl w:val="0"/>
-      </w:rPr>
-      <w:t xml:space="preserve"> Please make a copy.</w:t>
-    </w:r>
-    <w:r>
-      <w:rPr>
-        <w:rtl w:val="0"/>
-      </w:rPr>
-    </w:r>
-  </w:p>
 </w:hdr>
 </file>
 
 <file path=word/numbering.xml><?xml version="1.0" encoding="utf-8"?>
-<w:numbering xmlns:mc="http://schemas.openxmlformats.org/markup-compatibility/2006" xmlns:o="urn:schemas-microsoft-com:office:office" xmlns:r="http://schemas.openxmlformats.org/officeDocument/2006/relationships" xmlns:m="http://schemas.openxmlformats.org/officeDocument/2006/math" xmlns:v="urn:schemas-microsoft-com:vml" xmlns:wp="http://schemas.openxmlformats.org/drawingml/2006/wordprocessingDrawing" xmlns:w10="urn:schemas-microsoft-com:office:word" xmlns:w="http://schemas.openxmlformats.org/wordprocessingml/2006/main" xmlns:wne="http://schemas.microsoft.com/office/word/2006/wordml" xmlns:sl="http://schemas.openxmlformats.org/schemaLibrary/2006/main" xmlns:a="http://schemas.openxmlformats.org/drawingml/2006/main" xmlns:pic="http://schemas.openxmlformats.org/drawingml/2006/picture" xmlns:c="http://schemas.openxmlformats.org/drawingml/2006/chart" xmlns:lc="http://schemas.openxmlformats.org/drawingml/2006/lockedCanvas" xmlns:dgm="http://schemas.openxmlformats.org/drawingml/2006/diagram" xmlns:wps="http://schemas.microsoft.com/office/word/2010/wordprocessingShape" xmlns:wpg="http://schemas.microsoft.com/office/word/2010/wordprocessingGroup" xmlns:w14="http://schemas.microsoft.com/office/word/2010/wordml" xmlns:w15="http://schemas.microsoft.com/office/word/2012/wordml" xmlns:w16="http://schemas.microsoft.com/office/word/2018/wordml" xmlns:w16cex="http://schemas.microsoft.com/office/word/2018/wordml/cex" xmlns:w16cid="http://schemas.microsoft.com/office/word/2016/wordml/cid" xmlns="http://schemas.microsoft.com/office/tasks/2019/documenttasks" xmlns:cr="http://schemas.microsoft.com/office/comments/2020/reactions">
-  <w:abstractNum w:abstractNumId="1">
+<w:numbering xmlns:wpc="http://schemas.microsoft.com/office/word/2010/wordprocessingCanvas" xmlns:cx="http://schemas.microsoft.com/office/drawing/2014/chartex" xmlns:cx1="http://schemas.microsoft.com/office/drawing/2015/9/8/chartex" xmlns:cx2="http://schemas.microsoft.com/office/drawing/2015/10/21/chartex" xmlns:cx3="http://schemas.microsoft.com/office/drawing/2016/5/9/chartex" xmlns:cx4="http://schemas.microsoft.com/office/drawing/2016/5/10/chartex" xmlns:cx5="http://schemas.microsoft.com/office/drawing/2016/5/11/chartex" xmlns:cx6="http://schemas.microsoft.com/office/drawing/2016/5/12/chartex" xmlns:cx7="http://schemas.microsoft.com/office/drawing/2016/5/13/chartex" xmlns:cx8="http://schemas.microsoft.com/office/drawing/2016/5/14/chartex" xmlns:mc="http://schemas.openxmlformats.org/markup-compatibility/2006" xmlns:aink="http://schemas.microsoft.com/office/drawing/2016/ink" xmlns:am3d="http://schemas.microsoft.com/office/drawing/2017/model3d" xmlns:o="urn:schemas-microsoft-com:office:office" xmlns:oel="http://schemas.microsoft.com/office/2019/extlst" xmlns:r="http://schemas.openxmlformats.org/officeDocument/2006/relationships" xmlns:m="http://schemas.openxmlformats.org/officeDocument/2006/math" xmlns:v="urn:schemas-microsoft-com:vml" xmlns:wp14="http://schemas.microsoft.com/office/word/2010/wordprocessingDrawing" xmlns:wp="http://schemas.openxmlformats.org/drawingml/2006/wordprocessingDrawing" xmlns:w10="urn:schemas-microsoft-com:office:word" xmlns:w="http://schemas.openxmlformats.org/wordprocessingml/2006/main" xmlns:w14="http://schemas.microsoft.com/office/word/2010/wordml" xmlns:w15="http://schemas.microsoft.com/office/word/2012/wordml" xmlns:w16cex="http://schemas.microsoft.com/office/word/2018/wordml/cex" xmlns:w16cid="http://schemas.microsoft.com/office/word/2016/wordml/cid" xmlns:w16="http://schemas.microsoft.com/office/word/2018/wordml" xmlns:w16du="http://schemas.microsoft.com/office/word/2023/wordml/word16du" xmlns:w16sdtdh="http://schemas.microsoft.com/office/word/2020/wordml/sdtdatahash" xmlns:w16sdtfl="http://schemas.microsoft.com/office/word/2024/wordml/sdtformatlock" xmlns:w16se="http://schemas.microsoft.com/office/word/2015/wordml/symex" xmlns:wpg="http://schemas.microsoft.com/office/word/2010/wordprocessingGroup" xmlns:wpi="http://schemas.microsoft.com/office/word/2010/wordprocessingInk" xmlns:wne="http://schemas.microsoft.com/office/word/2006/wordml" xmlns:wps="http://schemas.microsoft.com/office/word/2010/wordprocessingShape" mc:Ignorable="w14 w15 w16se w16cid w16 w16cex w16sdtdh w16sdtfl w16du wp14">
+  <w:abstractNum w:abstractNumId="0" w15:restartNumberingAfterBreak="0">
+    <w:nsid w:val="4BE7320E"/>
+    <w:multiLevelType w:val="multilevel"/>
+    <w:tmpl w:val="E1D2E594"/>
     <w:lvl w:ilvl="0">
       <w:start w:val="1"/>
       <w:numFmt w:val="decimal"/>
@@ -1252,21 +1189,21 @@
       </w:rPr>
     </w:lvl>
   </w:abstractNum>
-  <w:num w:numId="1">
-    <w:abstractNumId w:val="1"/>
+  <w:num w:numId="1" w16cid:durableId="1553034292">
+    <w:abstractNumId w:val="0"/>
   </w:num>
 </w:numbering>
 </file>
 
 <file path=word/styles.xml><?xml version="1.0" encoding="utf-8"?>
-<w:styles xmlns:mc="http://schemas.openxmlformats.org/markup-compatibility/2006" xmlns:o="urn:schemas-microsoft-com:office:office" xmlns:r="http://schemas.openxmlformats.org/officeDocument/2006/relationships" xmlns:m="http://schemas.openxmlformats.org/officeDocument/2006/math" xmlns:v="urn:schemas-microsoft-com:vml" xmlns:wp="http://schemas.openxmlformats.org/drawingml/2006/wordprocessingDrawing" xmlns:w10="urn:schemas-microsoft-com:office:word" xmlns:w="http://schemas.openxmlformats.org/wordprocessingml/2006/main" xmlns:wne="http://schemas.microsoft.com/office/word/2006/wordml" xmlns:sl="http://schemas.openxmlformats.org/schemaLibrary/2006/main" xmlns:a="http://schemas.openxmlformats.org/drawingml/2006/main" xmlns:pic="http://schemas.openxmlformats.org/drawingml/2006/picture" xmlns:c="http://schemas.openxmlformats.org/drawingml/2006/chart" xmlns:lc="http://schemas.openxmlformats.org/drawingml/2006/lockedCanvas" xmlns:dgm="http://schemas.openxmlformats.org/drawingml/2006/diagram" xmlns:wps="http://schemas.microsoft.com/office/word/2010/wordprocessingShape" xmlns:wpg="http://schemas.microsoft.com/office/word/2010/wordprocessingGroup" xmlns:w14="http://schemas.microsoft.com/office/word/2010/wordml" xmlns:w15="http://schemas.microsoft.com/office/word/2012/wordml" xmlns:w16="http://schemas.microsoft.com/office/word/2018/wordml" xmlns:w16cex="http://schemas.microsoft.com/office/word/2018/wordml/cex" xmlns:w16cid="http://schemas.microsoft.com/office/word/2016/wordml/cid" xmlns="http://schemas.microsoft.com/office/tasks/2019/documenttasks" xmlns:cr="http://schemas.microsoft.com/office/comments/2020/reactions">
+<w:styles xmlns:mc="http://schemas.openxmlformats.org/markup-compatibility/2006" xmlns:r="http://schemas.openxmlformats.org/officeDocument/2006/relationships" xmlns:w="http://schemas.openxmlformats.org/wordprocessingml/2006/main" xmlns:w14="http://schemas.microsoft.com/office/word/2010/wordml" xmlns:w15="http://schemas.microsoft.com/office/word/2012/wordml" xmlns:w16cex="http://schemas.microsoft.com/office/word/2018/wordml/cex" xmlns:w16cid="http://schemas.microsoft.com/office/word/2016/wordml/cid" xmlns:w16="http://schemas.microsoft.com/office/word/2018/wordml" xmlns:w16du="http://schemas.microsoft.com/office/word/2023/wordml/word16du" xmlns:w16sdtdh="http://schemas.microsoft.com/office/word/2020/wordml/sdtdatahash" xmlns:w16sdtfl="http://schemas.microsoft.com/office/word/2024/wordml/sdtformatlock" xmlns:w16se="http://schemas.microsoft.com/office/word/2015/wordml/symex" mc:Ignorable="w14 w15 w16se w16cid w16 w16cex w16sdtdh w16sdtfl w16du">
   <w:docDefaults>
     <w:rPrDefault>
       <w:rPr>
-        <w:rFonts w:ascii="Proxima Nova" w:cs="Proxima Nova" w:eastAsia="Proxima Nova" w:hAnsi="Proxima Nova"/>
+        <w:rFonts w:ascii="Proxima Nova" w:eastAsia="Proxima Nova" w:hAnsi="Proxima Nova" w:cs="Proxima Nova"/>
         <w:sz w:val="22"/>
         <w:szCs w:val="22"/>
-        <w:lang w:val="en"/>
+        <w:lang w:val="en" w:eastAsia="en-US" w:bidi="ar-SA"/>
       </w:rPr>
     </w:rPrDefault>
     <w:pPrDefault>
@@ -1275,31 +1212,402 @@
       </w:pPr>
     </w:pPrDefault>
   </w:docDefaults>
-  <w:style w:type="table" w:styleId="TableNormal" w:default="1">
-    <w:name w:val="TableNormal"/>
-    <w:tblPr>
-      <w:tblCellMar>
-        <w:top w:w="100.0" w:type="dxa"/>
-        <w:left w:w="100.0" w:type="dxa"/>
-        <w:bottom w:w="100.0" w:type="dxa"/>
-        <w:right w:w="100.0" w:type="dxa"/>
-      </w:tblCellMar>
-    </w:tblPr>
-  </w:style>
-  <w:style w:type="paragraph" w:styleId="Normal" w:default="1">
-    <w:name w:val="normal"/>
+  <w:latentStyles w:defLockedState="0" w:defUIPriority="99" w:defSemiHidden="0" w:defUnhideWhenUsed="0" w:defQFormat="0" w:count="376">
+    <w:lsdException w:name="Normal" w:uiPriority="0" w:qFormat="1"/>
+    <w:lsdException w:name="heading 1" w:uiPriority="9" w:qFormat="1"/>
+    <w:lsdException w:name="heading 2" w:semiHidden="1" w:uiPriority="9" w:unhideWhenUsed="1" w:qFormat="1"/>
+    <w:lsdException w:name="heading 3" w:semiHidden="1" w:uiPriority="9" w:unhideWhenUsed="1" w:qFormat="1"/>
+    <w:lsdException w:name="heading 4" w:semiHidden="1" w:uiPriority="9" w:unhideWhenUsed="1" w:qFormat="1"/>
+    <w:lsdException w:name="heading 5" w:semiHidden="1" w:uiPriority="9" w:unhideWhenUsed="1" w:qFormat="1"/>
+    <w:lsdException w:name="heading 6" w:semiHidden="1" w:uiPriority="9" w:unhideWhenUsed="1" w:qFormat="1"/>
+    <w:lsdException w:name="heading 7" w:semiHidden="1" w:uiPriority="9" w:unhideWhenUsed="1" w:qFormat="1"/>
+    <w:lsdException w:name="heading 8" w:semiHidden="1" w:uiPriority="9" w:unhideWhenUsed="1" w:qFormat="1"/>
+    <w:lsdException w:name="heading 9" w:semiHidden="1" w:uiPriority="9" w:unhideWhenUsed="1" w:qFormat="1"/>
+    <w:lsdException w:name="index 1" w:semiHidden="1" w:unhideWhenUsed="1"/>
+    <w:lsdException w:name="index 2" w:semiHidden="1" w:unhideWhenUsed="1"/>
+    <w:lsdException w:name="index 3" w:semiHidden="1" w:unhideWhenUsed="1"/>
+    <w:lsdException w:name="index 4" w:semiHidden="1" w:unhideWhenUsed="1"/>
+    <w:lsdException w:name="index 5" w:semiHidden="1" w:unhideWhenUsed="1"/>
+    <w:lsdException w:name="index 6" w:semiHidden="1" w:unhideWhenUsed="1"/>
+    <w:lsdException w:name="index 7" w:semiHidden="1" w:unhideWhenUsed="1"/>
+    <w:lsdException w:name="index 8" w:semiHidden="1" w:unhideWhenUsed="1"/>
+    <w:lsdException w:name="index 9" w:semiHidden="1" w:unhideWhenUsed="1"/>
+    <w:lsdException w:name="toc 1" w:semiHidden="1" w:uiPriority="39" w:unhideWhenUsed="1"/>
+    <w:lsdException w:name="toc 2" w:semiHidden="1" w:uiPriority="39" w:unhideWhenUsed="1"/>
+    <w:lsdException w:name="toc 3" w:semiHidden="1" w:uiPriority="39" w:unhideWhenUsed="1"/>
+    <w:lsdException w:name="toc 4" w:semiHidden="1" w:uiPriority="39" w:unhideWhenUsed="1"/>
+    <w:lsdException w:name="toc 5" w:semiHidden="1" w:uiPriority="39" w:unhideWhenUsed="1"/>
+    <w:lsdException w:name="toc 6" w:semiHidden="1" w:uiPriority="39" w:unhideWhenUsed="1"/>
+    <w:lsdException w:name="toc 7" w:semiHidden="1" w:uiPriority="39" w:unhideWhenUsed="1"/>
+    <w:lsdException w:name="toc 8" w:semiHidden="1" w:uiPriority="39" w:unhideWhenUsed="1"/>
+    <w:lsdException w:name="toc 9" w:semiHidden="1" w:uiPriority="39" w:unhideWhenUsed="1"/>
+    <w:lsdException w:name="Normal Indent" w:semiHidden="1" w:unhideWhenUsed="1"/>
+    <w:lsdException w:name="footnote text" w:semiHidden="1" w:unhideWhenUsed="1"/>
+    <w:lsdException w:name="annotation text" w:semiHidden="1" w:unhideWhenUsed="1"/>
+    <w:lsdException w:name="header" w:semiHidden="1" w:unhideWhenUsed="1"/>
+    <w:lsdException w:name="footer" w:semiHidden="1" w:unhideWhenUsed="1"/>
+    <w:lsdException w:name="index heading" w:semiHidden="1" w:unhideWhenUsed="1"/>
+    <w:lsdException w:name="caption" w:semiHidden="1" w:uiPriority="35" w:unhideWhenUsed="1" w:qFormat="1"/>
+    <w:lsdException w:name="table of figures" w:semiHidden="1" w:unhideWhenUsed="1"/>
+    <w:lsdException w:name="envelope address" w:semiHidden="1" w:unhideWhenUsed="1"/>
+    <w:lsdException w:name="envelope return" w:semiHidden="1" w:unhideWhenUsed="1"/>
+    <w:lsdException w:name="footnote reference" w:semiHidden="1" w:unhideWhenUsed="1"/>
+    <w:lsdException w:name="annotation reference" w:semiHidden="1" w:unhideWhenUsed="1"/>
+    <w:lsdException w:name="line number" w:semiHidden="1" w:unhideWhenUsed="1"/>
+    <w:lsdException w:name="page number" w:semiHidden="1" w:unhideWhenUsed="1"/>
+    <w:lsdException w:name="endnote reference" w:semiHidden="1" w:unhideWhenUsed="1"/>
+    <w:lsdException w:name="endnote text" w:semiHidden="1" w:unhideWhenUsed="1"/>
+    <w:lsdException w:name="table of authorities" w:semiHidden="1" w:unhideWhenUsed="1"/>
+    <w:lsdException w:name="macro" w:semiHidden="1" w:unhideWhenUsed="1"/>
+    <w:lsdException w:name="toa heading" w:semiHidden="1" w:unhideWhenUsed="1"/>
+    <w:lsdException w:name="List" w:semiHidden="1" w:unhideWhenUsed="1"/>
+    <w:lsdException w:name="List Bullet" w:semiHidden="1" w:unhideWhenUsed="1"/>
+    <w:lsdException w:name="List Number" w:semiHidden="1" w:unhideWhenUsed="1"/>
+    <w:lsdException w:name="List 2" w:semiHidden="1" w:unhideWhenUsed="1"/>
+    <w:lsdException w:name="List 3" w:semiHidden="1" w:unhideWhenUsed="1"/>
+    <w:lsdException w:name="List 4" w:semiHidden="1" w:unhideWhenUsed="1"/>
+    <w:lsdException w:name="List 5" w:semiHidden="1" w:unhideWhenUsed="1"/>
+    <w:lsdException w:name="List Bullet 2" w:semiHidden="1" w:unhideWhenUsed="1"/>
+    <w:lsdException w:name="List Bullet 3" w:semiHidden="1" w:unhideWhenUsed="1"/>
+    <w:lsdException w:name="List Bullet 4" w:semiHidden="1" w:unhideWhenUsed="1"/>
+    <w:lsdException w:name="List Bullet 5" w:semiHidden="1" w:unhideWhenUsed="1"/>
+    <w:lsdException w:name="List Number 2" w:semiHidden="1" w:unhideWhenUsed="1"/>
+    <w:lsdException w:name="List Number 3" w:semiHidden="1" w:unhideWhenUsed="1"/>
+    <w:lsdException w:name="List Number 4" w:semiHidden="1" w:unhideWhenUsed="1"/>
+    <w:lsdException w:name="List Number 5" w:semiHidden="1" w:unhideWhenUsed="1"/>
+    <w:lsdException w:name="Title" w:uiPriority="10" w:qFormat="1"/>
+    <w:lsdException w:name="Closing" w:semiHidden="1" w:unhideWhenUsed="1"/>
+    <w:lsdException w:name="Signature" w:semiHidden="1" w:unhideWhenUsed="1"/>
+    <w:lsdException w:name="Default Paragraph Font" w:semiHidden="1" w:uiPriority="1" w:unhideWhenUsed="1"/>
+    <w:lsdException w:name="Body Text" w:semiHidden="1" w:unhideWhenUsed="1"/>
+    <w:lsdException w:name="Body Text Indent" w:semiHidden="1" w:unhideWhenUsed="1"/>
+    <w:lsdException w:name="List Continue" w:semiHidden="1" w:unhideWhenUsed="1"/>
+    <w:lsdException w:name="List Continue 2" w:semiHidden="1" w:unhideWhenUsed="1"/>
+    <w:lsdException w:name="List Continue 3" w:semiHidden="1" w:unhideWhenUsed="1"/>
+    <w:lsdException w:name="List Continue 4" w:semiHidden="1" w:unhideWhenUsed="1"/>
+    <w:lsdException w:name="List Continue 5" w:semiHidden="1" w:unhideWhenUsed="1"/>
+    <w:lsdException w:name="Message Header" w:semiHidden="1" w:unhideWhenUsed="1"/>
+    <w:lsdException w:name="Subtitle" w:uiPriority="11" w:qFormat="1"/>
+    <w:lsdException w:name="Salutation" w:semiHidden="1" w:unhideWhenUsed="1"/>
+    <w:lsdException w:name="Date" w:semiHidden="1" w:unhideWhenUsed="1"/>
+    <w:lsdException w:name="Body Text First Indent" w:semiHidden="1" w:unhideWhenUsed="1"/>
+    <w:lsdException w:name="Body Text First Indent 2" w:semiHidden="1" w:unhideWhenUsed="1"/>
+    <w:lsdException w:name="Note Heading" w:semiHidden="1" w:unhideWhenUsed="1"/>
+    <w:lsdException w:name="Body Text 2" w:semiHidden="1" w:unhideWhenUsed="1"/>
+    <w:lsdException w:name="Body Text 3" w:semiHidden="1" w:unhideWhenUsed="1"/>
+    <w:lsdException w:name="Body Text Indent 2" w:semiHidden="1" w:unhideWhenUsed="1"/>
+    <w:lsdException w:name="Body Text Indent 3" w:semiHidden="1" w:unhideWhenUsed="1"/>
+    <w:lsdException w:name="Block Text" w:semiHidden="1" w:unhideWhenUsed="1"/>
+    <w:lsdException w:name="Hyperlink" w:semiHidden="1" w:unhideWhenUsed="1"/>
+    <w:lsdException w:name="FollowedHyperlink" w:semiHidden="1" w:unhideWhenUsed="1"/>
+    <w:lsdException w:name="Strong" w:uiPriority="22" w:qFormat="1"/>
+    <w:lsdException w:name="Emphasis" w:uiPriority="20" w:qFormat="1"/>
+    <w:lsdException w:name="Document Map" w:semiHidden="1" w:unhideWhenUsed="1"/>
+    <w:lsdException w:name="Plain Text" w:semiHidden="1" w:unhideWhenUsed="1"/>
+    <w:lsdException w:name="E-mail Signature" w:semiHidden="1" w:unhideWhenUsed="1"/>
+    <w:lsdException w:name="HTML Top of Form" w:semiHidden="1" w:unhideWhenUsed="1"/>
+    <w:lsdException w:name="HTML Bottom of Form" w:semiHidden="1" w:unhideWhenUsed="1"/>
+    <w:lsdException w:name="Normal (Web)" w:semiHidden="1" w:unhideWhenUsed="1"/>
+    <w:lsdException w:name="HTML Acronym" w:semiHidden="1" w:unhideWhenUsed="1"/>
+    <w:lsdException w:name="HTML Address" w:semiHidden="1" w:unhideWhenUsed="1"/>
+    <w:lsdException w:name="HTML Cite" w:semiHidden="1" w:unhideWhenUsed="1"/>
+    <w:lsdException w:name="HTML Code" w:semiHidden="1" w:unhideWhenUsed="1"/>
+    <w:lsdException w:name="HTML Definition" w:semiHidden="1" w:unhideWhenUsed="1"/>
+    <w:lsdException w:name="HTML Keyboard" w:semiHidden="1" w:unhideWhenUsed="1"/>
+    <w:lsdException w:name="HTML Preformatted" w:semiHidden="1" w:unhideWhenUsed="1"/>
+    <w:lsdException w:name="HTML Sample" w:semiHidden="1" w:unhideWhenUsed="1"/>
+    <w:lsdException w:name="HTML Typewriter" w:semiHidden="1" w:unhideWhenUsed="1"/>
+    <w:lsdException w:name="HTML Variable" w:semiHidden="1" w:unhideWhenUsed="1"/>
+    <w:lsdException w:name="Normal Table" w:semiHidden="1" w:unhideWhenUsed="1"/>
+    <w:lsdException w:name="annotation subject" w:semiHidden="1" w:unhideWhenUsed="1"/>
+    <w:lsdException w:name="No List" w:semiHidden="1" w:unhideWhenUsed="1"/>
+    <w:lsdException w:name="Outline List 1" w:semiHidden="1" w:unhideWhenUsed="1"/>
+    <w:lsdException w:name="Outline List 2" w:semiHidden="1" w:unhideWhenUsed="1"/>
+    <w:lsdException w:name="Outline List 3" w:semiHidden="1" w:unhideWhenUsed="1"/>
+    <w:lsdException w:name="Table Simple 1" w:semiHidden="1" w:unhideWhenUsed="1"/>
+    <w:lsdException w:name="Table Simple 2" w:semiHidden="1" w:unhideWhenUsed="1"/>
+    <w:lsdException w:name="Table Simple 3" w:semiHidden="1" w:unhideWhenUsed="1"/>
+    <w:lsdException w:name="Table Classic 1" w:semiHidden="1" w:unhideWhenUsed="1"/>
+    <w:lsdException w:name="Table Classic 2" w:semiHidden="1" w:unhideWhenUsed="1"/>
+    <w:lsdException w:name="Table Classic 3" w:semiHidden="1" w:unhideWhenUsed="1"/>
+    <w:lsdException w:name="Table Classic 4" w:semiHidden="1" w:unhideWhenUsed="1"/>
+    <w:lsdException w:name="Table Colorful 1" w:semiHidden="1" w:unhideWhenUsed="1"/>
+    <w:lsdException w:name="Table Colorful 2" w:semiHidden="1" w:unhideWhenUsed="1"/>
+    <w:lsdException w:name="Table Colorful 3" w:semiHidden="1" w:unhideWhenUsed="1"/>
+    <w:lsdException w:name="Table Columns 1" w:semiHidden="1" w:unhideWhenUsed="1"/>
+    <w:lsdException w:name="Table Columns 2" w:semiHidden="1" w:unhideWhenUsed="1"/>
+    <w:lsdException w:name="Table Columns 3" w:semiHidden="1" w:unhideWhenUsed="1"/>
+    <w:lsdException w:name="Table Columns 4" w:semiHidden="1" w:unhideWhenUsed="1"/>
+    <w:lsdException w:name="Table Columns 5" w:semiHidden="1" w:unhideWhenUsed="1"/>
+    <w:lsdException w:name="Table Grid 1" w:semiHidden="1" w:unhideWhenUsed="1"/>
+    <w:lsdException w:name="Table Grid 2" w:semiHidden="1" w:unhideWhenUsed="1"/>
+    <w:lsdException w:name="Table Grid 3" w:semiHidden="1" w:unhideWhenUsed="1"/>
+    <w:lsdException w:name="Table Grid 4" w:semiHidden="1" w:unhideWhenUsed="1"/>
+    <w:lsdException w:name="Table Grid 5" w:semiHidden="1" w:unhideWhenUsed="1"/>
+    <w:lsdException w:name="Table Grid 6" w:semiHidden="1" w:unhideWhenUsed="1"/>
+    <w:lsdException w:name="Table Grid 7" w:semiHidden="1" w:unhideWhenUsed="1"/>
+    <w:lsdException w:name="Table Grid 8" w:semiHidden="1" w:unhideWhenUsed="1"/>
+    <w:lsdException w:name="Table List 1" w:semiHidden="1" w:unhideWhenUsed="1"/>
+    <w:lsdException w:name="Table List 2" w:semiHidden="1" w:unhideWhenUsed="1"/>
+    <w:lsdException w:name="Table List 3" w:semiHidden="1" w:unhideWhenUsed="1"/>
+    <w:lsdException w:name="Table List 4" w:semiHidden="1" w:unhideWhenUsed="1"/>
+    <w:lsdException w:name="Table List 5" w:semiHidden="1" w:unhideWhenUsed="1"/>
+    <w:lsdException w:name="Table List 6" w:semiHidden="1" w:unhideWhenUsed="1"/>
+    <w:lsdException w:name="Table List 7" w:semiHidden="1" w:unhideWhenUsed="1"/>
+    <w:lsdException w:name="Table List 8" w:semiHidden="1" w:unhideWhenUsed="1"/>
+    <w:lsdException w:name="Table 3D effects 1" w:semiHidden="1" w:unhideWhenUsed="1"/>
+    <w:lsdException w:name="Table 3D effects 2" w:semiHidden="1" w:unhideWhenUsed="1"/>
+    <w:lsdException w:name="Table 3D effects 3" w:semiHidden="1" w:unhideWhenUsed="1"/>
+    <w:lsdException w:name="Table Contemporary" w:semiHidden="1" w:unhideWhenUsed="1"/>
+    <w:lsdException w:name="Table Elegant" w:semiHidden="1" w:unhideWhenUsed="1"/>
+    <w:lsdException w:name="Table Professional" w:semiHidden="1" w:unhideWhenUsed="1"/>
+    <w:lsdException w:name="Table Subtle 1" w:semiHidden="1" w:unhideWhenUsed="1"/>
+    <w:lsdException w:name="Table Subtle 2" w:semiHidden="1" w:unhideWhenUsed="1"/>
+    <w:lsdException w:name="Table Web 1" w:semiHidden="1" w:unhideWhenUsed="1"/>
+    <w:lsdException w:name="Table Web 2" w:semiHidden="1" w:unhideWhenUsed="1"/>
+    <w:lsdException w:name="Table Web 3" w:semiHidden="1" w:unhideWhenUsed="1"/>
+    <w:lsdException w:name="Balloon Text" w:semiHidden="1" w:unhideWhenUsed="1"/>
+    <w:lsdException w:name="Table Grid" w:uiPriority="39"/>
+    <w:lsdException w:name="Table Theme" w:semiHidden="1" w:unhideWhenUsed="1"/>
+    <w:lsdException w:name="Placeholder Text" w:semiHidden="1"/>
+    <w:lsdException w:name="No Spacing" w:uiPriority="1" w:qFormat="1"/>
+    <w:lsdException w:name="Light Shading" w:uiPriority="60"/>
+    <w:lsdException w:name="Light List" w:uiPriority="61"/>
+    <w:lsdException w:name="Light Grid" w:uiPriority="62"/>
+    <w:lsdException w:name="Medium Shading 1" w:uiPriority="63"/>
+    <w:lsdException w:name="Medium Shading 2" w:uiPriority="64"/>
+    <w:lsdException w:name="Medium List 1" w:uiPriority="65"/>
+    <w:lsdException w:name="Medium List 2" w:uiPriority="66"/>
+    <w:lsdException w:name="Medium Grid 1" w:uiPriority="67"/>
+    <w:lsdException w:name="Medium Grid 2" w:uiPriority="68"/>
+    <w:lsdException w:name="Medium Grid 3" w:uiPriority="69"/>
+    <w:lsdException w:name="Dark List" w:uiPriority="70"/>
+    <w:lsdException w:name="Colorful Shading" w:uiPriority="71"/>
+    <w:lsdException w:name="Colorful List" w:uiPriority="72"/>
+    <w:lsdException w:name="Colorful Grid" w:uiPriority="73"/>
+    <w:lsdException w:name="Light Shading Accent 1" w:uiPriority="60"/>
+    <w:lsdException w:name="Light List Accent 1" w:uiPriority="61"/>
+    <w:lsdException w:name="Light Grid Accent 1" w:uiPriority="62"/>
+    <w:lsdException w:name="Medium Shading 1 Accent 1" w:uiPriority="63"/>
+    <w:lsdException w:name="Medium Shading 2 Accent 1" w:uiPriority="64"/>
+    <w:lsdException w:name="Medium List 1 Accent 1" w:uiPriority="65"/>
+    <w:lsdException w:name="Revision" w:semiHidden="1"/>
+    <w:lsdException w:name="List Paragraph" w:uiPriority="34" w:qFormat="1"/>
+    <w:lsdException w:name="Quote" w:uiPriority="29" w:qFormat="1"/>
+    <w:lsdException w:name="Intense Quote" w:uiPriority="30" w:qFormat="1"/>
+    <w:lsdException w:name="Medium List 2 Accent 1" w:uiPriority="66"/>
+    <w:lsdException w:name="Medium Grid 1 Accent 1" w:uiPriority="67"/>
+    <w:lsdException w:name="Medium Grid 2 Accent 1" w:uiPriority="68"/>
+    <w:lsdException w:name="Medium Grid 3 Accent 1" w:uiPriority="69"/>
+    <w:lsdException w:name="Dark List Accent 1" w:uiPriority="70"/>
+    <w:lsdException w:name="Colorful Shading Accent 1" w:uiPriority="71"/>
+    <w:lsdException w:name="Colorful List Accent 1" w:uiPriority="72"/>
+    <w:lsdException w:name="Colorful Grid Accent 1" w:uiPriority="73"/>
+    <w:lsdException w:name="Light Shading Accent 2" w:uiPriority="60"/>
+    <w:lsdException w:name="Light List Accent 2" w:uiPriority="61"/>
+    <w:lsdException w:name="Light Grid Accent 2" w:uiPriority="62"/>
+    <w:lsdException w:name="Medium Shading 1 Accent 2" w:uiPriority="63"/>
+    <w:lsdException w:name="Medium Shading 2 Accent 2" w:uiPriority="64"/>
+    <w:lsdException w:name="Medium List 1 Accent 2" w:uiPriority="65"/>
+    <w:lsdException w:name="Medium List 2 Accent 2" w:uiPriority="66"/>
+    <w:lsdException w:name="Medium Grid 1 Accent 2" w:uiPriority="67"/>
+    <w:lsdException w:name="Medium Grid 2 Accent 2" w:uiPriority="68"/>
+    <w:lsdException w:name="Medium Grid 3 Accent 2" w:uiPriority="69"/>
+    <w:lsdException w:name="Dark List Accent 2" w:uiPriority="70"/>
+    <w:lsdException w:name="Colorful Shading Accent 2" w:uiPriority="71"/>
+    <w:lsdException w:name="Colorful List Accent 2" w:uiPriority="72"/>
+    <w:lsdException w:name="Colorful Grid Accent 2" w:uiPriority="73"/>
+    <w:lsdException w:name="Light Shading Accent 3" w:uiPriority="60"/>
+    <w:lsdException w:name="Light List Accent 3" w:uiPriority="61"/>
+    <w:lsdException w:name="Light Grid Accent 3" w:uiPriority="62"/>
+    <w:lsdException w:name="Medium Shading 1 Accent 3" w:uiPriority="63"/>
+    <w:lsdException w:name="Medium Shading 2 Accent 3" w:uiPriority="64"/>
+    <w:lsdException w:name="Medium List 1 Accent 3" w:uiPriority="65"/>
+    <w:lsdException w:name="Medium List 2 Accent 3" w:uiPriority="66"/>
+    <w:lsdException w:name="Medium Grid 1 Accent 3" w:uiPriority="67"/>
+    <w:lsdException w:name="Medium Grid 2 Accent 3" w:uiPriority="68"/>
+    <w:lsdException w:name="Medium Grid 3 Accent 3" w:uiPriority="69"/>
+    <w:lsdException w:name="Dark List Accent 3" w:uiPriority="70"/>
+    <w:lsdException w:name="Colorful Shading Accent 3" w:uiPriority="71"/>
+    <w:lsdException w:name="Colorful List Accent 3" w:uiPriority="72"/>
+    <w:lsdException w:name="Colorful Grid Accent 3" w:uiPriority="73"/>
+    <w:lsdException w:name="Light Shading Accent 4" w:uiPriority="60"/>
+    <w:lsdException w:name="Light List Accent 4" w:uiPriority="61"/>
+    <w:lsdException w:name="Light Grid Accent 4" w:uiPriority="62"/>
+    <w:lsdException w:name="Medium Shading 1 Accent 4" w:uiPriority="63"/>
+    <w:lsdException w:name="Medium Shading 2 Accent 4" w:uiPriority="64"/>
+    <w:lsdException w:name="Medium List 1 Accent 4" w:uiPriority="65"/>
+    <w:lsdException w:name="Medium List 2 Accent 4" w:uiPriority="66"/>
+    <w:lsdException w:name="Medium Grid 1 Accent 4" w:uiPriority="67"/>
+    <w:lsdException w:name="Medium Grid 2 Accent 4" w:uiPriority="68"/>
+    <w:lsdException w:name="Medium Grid 3 Accent 4" w:uiPriority="69"/>
+    <w:lsdException w:name="Dark List Accent 4" w:uiPriority="70"/>
+    <w:lsdException w:name="Colorful Shading Accent 4" w:uiPriority="71"/>
+    <w:lsdException w:name="Colorful List Accent 4" w:uiPriority="72"/>
+    <w:lsdException w:name="Colorful Grid Accent 4" w:uiPriority="73"/>
+    <w:lsdException w:name="Light Shading Accent 5" w:uiPriority="60"/>
+    <w:lsdException w:name="Light List Accent 5" w:uiPriority="61"/>
+    <w:lsdException w:name="Light Grid Accent 5" w:uiPriority="62"/>
+    <w:lsdException w:name="Medium Shading 1 Accent 5" w:uiPriority="63"/>
+    <w:lsdException w:name="Medium Shading 2 Accent 5" w:uiPriority="64"/>
+    <w:lsdException w:name="Medium List 1 Accent 5" w:uiPriority="65"/>
+    <w:lsdException w:name="Medium List 2 Accent 5" w:uiPriority="66"/>
+    <w:lsdException w:name="Medium Grid 1 Accent 5" w:uiPriority="67"/>
+    <w:lsdException w:name="Medium Grid 2 Accent 5" w:uiPriority="68"/>
+    <w:lsdException w:name="Medium Grid 3 Accent 5" w:uiPriority="69"/>
+    <w:lsdException w:name="Dark List Accent 5" w:uiPriority="70"/>
+    <w:lsdException w:name="Colorful Shading Accent 5" w:uiPriority="71"/>
+    <w:lsdException w:name="Colorful List Accent 5" w:uiPriority="72"/>
+    <w:lsdException w:name="Colorful Grid Accent 5" w:uiPriority="73"/>
+    <w:lsdException w:name="Light Shading Accent 6" w:uiPriority="60"/>
+    <w:lsdException w:name="Light List Accent 6" w:uiPriority="61"/>
+    <w:lsdException w:name="Light Grid Accent 6" w:uiPriority="62"/>
+    <w:lsdException w:name="Medium Shading 1 Accent 6" w:uiPriority="63"/>
+    <w:lsdException w:name="Medium Shading 2 Accent 6" w:uiPriority="64"/>
+    <w:lsdException w:name="Medium List 1 Accent 6" w:uiPriority="65"/>
+    <w:lsdException w:name="Medium List 2 Accent 6" w:uiPriority="66"/>
+    <w:lsdException w:name="Medium Grid 1 Accent 6" w:uiPriority="67"/>
+    <w:lsdException w:name="Medium Grid 2 Accent 6" w:uiPriority="68"/>
+    <w:lsdException w:name="Medium Grid 3 Accent 6" w:uiPriority="69"/>
+    <w:lsdException w:name="Dark List Accent 6" w:uiPriority="70"/>
+    <w:lsdException w:name="Colorful Shading Accent 6" w:uiPriority="71"/>
+    <w:lsdException w:name="Colorful List Accent 6" w:uiPriority="72"/>
+    <w:lsdException w:name="Colorful Grid Accent 6" w:uiPriority="73"/>
+    <w:lsdException w:name="Subtle Emphasis" w:uiPriority="19" w:qFormat="1"/>
+    <w:lsdException w:name="Intense Emphasis" w:uiPriority="21" w:qFormat="1"/>
+    <w:lsdException w:name="Subtle Reference" w:uiPriority="31" w:qFormat="1"/>
+    <w:lsdException w:name="Intense Reference" w:uiPriority="32" w:qFormat="1"/>
+    <w:lsdException w:name="Book Title" w:uiPriority="33" w:qFormat="1"/>
+    <w:lsdException w:name="Bibliography" w:semiHidden="1" w:uiPriority="37" w:unhideWhenUsed="1"/>
+    <w:lsdException w:name="TOC Heading" w:semiHidden="1" w:uiPriority="39" w:unhideWhenUsed="1" w:qFormat="1"/>
+    <w:lsdException w:name="Plain Table 1" w:uiPriority="41"/>
+    <w:lsdException w:name="Plain Table 2" w:uiPriority="42"/>
+    <w:lsdException w:name="Plain Table 3" w:uiPriority="43"/>
+    <w:lsdException w:name="Plain Table 4" w:uiPriority="44"/>
+    <w:lsdException w:name="Plain Table 5" w:uiPriority="45"/>
+    <w:lsdException w:name="Grid Table Light" w:uiPriority="40"/>
+    <w:lsdException w:name="Grid Table 1 Light" w:uiPriority="46"/>
+    <w:lsdException w:name="Grid Table 2" w:uiPriority="47"/>
+    <w:lsdException w:name="Grid Table 3" w:uiPriority="48"/>
+    <w:lsdException w:name="Grid Table 4" w:uiPriority="49"/>
+    <w:lsdException w:name="Grid Table 5 Dark" w:uiPriority="50"/>
+    <w:lsdException w:name="Grid Table 6 Colorful" w:uiPriority="51"/>
+    <w:lsdException w:name="Grid Table 7 Colorful" w:uiPriority="52"/>
+    <w:lsdException w:name="Grid Table 1 Light Accent 1" w:uiPriority="46"/>
+    <w:lsdException w:name="Grid Table 2 Accent 1" w:uiPriority="47"/>
+    <w:lsdException w:name="Grid Table 3 Accent 1" w:uiPriority="48"/>
+    <w:lsdException w:name="Grid Table 4 Accent 1" w:uiPriority="49"/>
+    <w:lsdException w:name="Grid Table 5 Dark Accent 1" w:uiPriority="50"/>
+    <w:lsdException w:name="Grid Table 6 Colorful Accent 1" w:uiPriority="51"/>
+    <w:lsdException w:name="Grid Table 7 Colorful Accent 1" w:uiPriority="52"/>
+    <w:lsdException w:name="Grid Table 1 Light Accent 2" w:uiPriority="46"/>
+    <w:lsdException w:name="Grid Table 2 Accent 2" w:uiPriority="47"/>
+    <w:lsdException w:name="Grid Table 3 Accent 2" w:uiPriority="48"/>
+    <w:lsdException w:name="Grid Table 4 Accent 2" w:uiPriority="49"/>
+    <w:lsdException w:name="Grid Table 5 Dark Accent 2" w:uiPriority="50"/>
+    <w:lsdException w:name="Grid Table 6 Colorful Accent 2" w:uiPriority="51"/>
+    <w:lsdException w:name="Grid Table 7 Colorful Accent 2" w:uiPriority="52"/>
+    <w:lsdException w:name="Grid Table 1 Light Accent 3" w:uiPriority="46"/>
+    <w:lsdException w:name="Grid Table 2 Accent 3" w:uiPriority="47"/>
+    <w:lsdException w:name="Grid Table 3 Accent 3" w:uiPriority="48"/>
+    <w:lsdException w:name="Grid Table 4 Accent 3" w:uiPriority="49"/>
+    <w:lsdException w:name="Grid Table 5 Dark Accent 3" w:uiPriority="50"/>
+    <w:lsdException w:name="Grid Table 6 Colorful Accent 3" w:uiPriority="51"/>
+    <w:lsdException w:name="Grid Table 7 Colorful Accent 3" w:uiPriority="52"/>
+    <w:lsdException w:name="Grid Table 1 Light Accent 4" w:uiPriority="46"/>
+    <w:lsdException w:name="Grid Table 2 Accent 4" w:uiPriority="47"/>
+    <w:lsdException w:name="Grid Table 3 Accent 4" w:uiPriority="48"/>
+    <w:lsdException w:name="Grid Table 4 Accent 4" w:uiPriority="49"/>
+    <w:lsdException w:name="Grid Table 5 Dark Accent 4" w:uiPriority="50"/>
+    <w:lsdException w:name="Grid Table 6 Colorful Accent 4" w:uiPriority="51"/>
+    <w:lsdException w:name="Grid Table 7 Colorful Accent 4" w:uiPriority="52"/>
+    <w:lsdException w:name="Grid Table 1 Light Accent 5" w:uiPriority="46"/>
+    <w:lsdException w:name="Grid Table 2 Accent 5" w:uiPriority="47"/>
+    <w:lsdException w:name="Grid Table 3 Accent 5" w:uiPriority="48"/>
+    <w:lsdException w:name="Grid Table 4 Accent 5" w:uiPriority="49"/>
+    <w:lsdException w:name="Grid Table 5 Dark Accent 5" w:uiPriority="50"/>
+    <w:lsdException w:name="Grid Table 6 Colorful Accent 5" w:uiPriority="51"/>
+    <w:lsdException w:name="Grid Table 7 Colorful Accent 5" w:uiPriority="52"/>
+    <w:lsdException w:name="Grid Table 1 Light Accent 6" w:uiPriority="46"/>
+    <w:lsdException w:name="Grid Table 2 Accent 6" w:uiPriority="47"/>
+    <w:lsdException w:name="Grid Table 3 Accent 6" w:uiPriority="48"/>
+    <w:lsdException w:name="Grid Table 4 Accent 6" w:uiPriority="49"/>
+    <w:lsdException w:name="Grid Table 5 Dark Accent 6" w:uiPriority="50"/>
+    <w:lsdException w:name="Grid Table 6 Colorful Accent 6" w:uiPriority="51"/>
+    <w:lsdException w:name="Grid Table 7 Colorful Accent 6" w:uiPriority="52"/>
+    <w:lsdException w:name="List Table 1 Light" w:uiPriority="46"/>
+    <w:lsdException w:name="List Table 2" w:uiPriority="47"/>
+    <w:lsdException w:name="List Table 3" w:uiPriority="48"/>
+    <w:lsdException w:name="List Table 4" w:uiPriority="49"/>
+    <w:lsdException w:name="List Table 5 Dark" w:uiPriority="50"/>
+    <w:lsdException w:name="List Table 6 Colorful" w:uiPriority="51"/>
+    <w:lsdException w:name="List Table 7 Colorful" w:uiPriority="52"/>
+    <w:lsdException w:name="List Table 1 Light Accent 1" w:uiPriority="46"/>
+    <w:lsdException w:name="List Table 2 Accent 1" w:uiPriority="47"/>
+    <w:lsdException w:name="List Table 3 Accent 1" w:uiPriority="48"/>
+    <w:lsdException w:name="List Table 4 Accent 1" w:uiPriority="49"/>
+    <w:lsdException w:name="List Table 5 Dark Accent 1" w:uiPriority="50"/>
+    <w:lsdException w:name="List Table 6 Colorful Accent 1" w:uiPriority="51"/>
+    <w:lsdException w:name="List Table 7 Colorful Accent 1" w:uiPriority="52"/>
+    <w:lsdException w:name="List Table 1 Light Accent 2" w:uiPriority="46"/>
+    <w:lsdException w:name="List Table 2 Accent 2" w:uiPriority="47"/>
+    <w:lsdException w:name="List Table 3 Accent 2" w:uiPriority="48"/>
+    <w:lsdException w:name="List Table 4 Accent 2" w:uiPriority="49"/>
+    <w:lsdException w:name="List Table 5 Dark Accent 2" w:uiPriority="50"/>
+    <w:lsdException w:name="List Table 6 Colorful Accent 2" w:uiPriority="51"/>
+    <w:lsdException w:name="List Table 7 Colorful Accent 2" w:uiPriority="52"/>
+    <w:lsdException w:name="List Table 1 Light Accent 3" w:uiPriority="46"/>
+    <w:lsdException w:name="List Table 2 Accent 3" w:uiPriority="47"/>
+    <w:lsdException w:name="List Table 3 Accent 3" w:uiPriority="48"/>
+    <w:lsdException w:name="List Table 4 Accent 3" w:uiPriority="49"/>
+    <w:lsdException w:name="List Table 5 Dark Accent 3" w:uiPriority="50"/>
+    <w:lsdException w:name="List Table 6 Colorful Accent 3" w:uiPriority="51"/>
+    <w:lsdException w:name="List Table 7 Colorful Accent 3" w:uiPriority="52"/>
+    <w:lsdException w:name="List Table 1 Light Accent 4" w:uiPriority="46"/>
+    <w:lsdException w:name="List Table 2 Accent 4" w:uiPriority="47"/>
+    <w:lsdException w:name="List Table 3 Accent 4" w:uiPriority="48"/>
+    <w:lsdException w:name="List Table 4 Accent 4" w:uiPriority="49"/>
+    <w:lsdException w:name="List Table 5 Dark Accent 4" w:uiPriority="50"/>
+    <w:lsdException w:name="List Table 6 Colorful Accent 4" w:uiPriority="51"/>
+    <w:lsdException w:name="List Table 7 Colorful Accent 4" w:uiPriority="52"/>
+    <w:lsdException w:name="List Table 1 Light Accent 5" w:uiPriority="46"/>
+    <w:lsdException w:name="List Table 2 Accent 5" w:uiPriority="47"/>
+    <w:lsdException w:name="List Table 3 Accent 5" w:uiPriority="48"/>
+    <w:lsdException w:name="List Table 4 Accent 5" w:uiPriority="49"/>
+    <w:lsdException w:name="List Table 5 Dark Accent 5" w:uiPriority="50"/>
+    <w:lsdException w:name="List Table 6 Colorful Accent 5" w:uiPriority="51"/>
+    <w:lsdException w:name="List Table 7 Colorful Accent 5" w:uiPriority="52"/>
+    <w:lsdException w:name="List Table 1 Light Accent 6" w:uiPriority="46"/>
+    <w:lsdException w:name="List Table 2 Accent 6" w:uiPriority="47"/>
+    <w:lsdException w:name="List Table 3 Accent 6" w:uiPriority="48"/>
+    <w:lsdException w:name="List Table 4 Accent 6" w:uiPriority="49"/>
+    <w:lsdException w:name="List Table 5 Dark Accent 6" w:uiPriority="50"/>
+    <w:lsdException w:name="List Table 6 Colorful Accent 6" w:uiPriority="51"/>
+    <w:lsdException w:name="List Table 7 Colorful Accent 6" w:uiPriority="52"/>
+    <w:lsdException w:name="Mention" w:semiHidden="1" w:unhideWhenUsed="1"/>
+    <w:lsdException w:name="Smart Hyperlink" w:semiHidden="1" w:unhideWhenUsed="1"/>
+    <w:lsdException w:name="Hashtag" w:semiHidden="1" w:unhideWhenUsed="1"/>
+    <w:lsdException w:name="Unresolved Mention" w:semiHidden="1" w:unhideWhenUsed="1"/>
+    <w:lsdException w:name="Smart Link" w:semiHidden="1" w:unhideWhenUsed="1"/>
+  </w:latentStyles>
+  <w:style w:type="paragraph" w:default="1" w:styleId="Normal">
+    <w:name w:val="Normal"/>
+    <w:qFormat/>
   </w:style>
   <w:style w:type="paragraph" w:styleId="Heading1">
     <w:name w:val="heading 1"/>
     <w:basedOn w:val="Normal"/>
     <w:next w:val="Normal"/>
+    <w:uiPriority w:val="9"/>
+    <w:qFormat/>
     <w:pPr>
-      <w:keepNext w:val="1"/>
-      <w:keepLines w:val="1"/>
+      <w:keepNext/>
+      <w:keepLines/>
       <w:spacing w:before="1440" w:line="240" w:lineRule="auto"/>
+      <w:outlineLvl w:val="0"/>
     </w:pPr>
     <w:rPr>
-      <w:rFonts w:ascii="Helvetica Neue" w:cs="Helvetica Neue" w:eastAsia="Helvetica Neue" w:hAnsi="Helvetica Neue"/>
+      <w:rFonts w:ascii="Helvetica Neue" w:eastAsia="Helvetica Neue" w:hAnsi="Helvetica Neue" w:cs="Helvetica Neue"/>
       <w:color w:val="611940"/>
       <w:sz w:val="72"/>
       <w:szCs w:val="72"/>
@@ -1309,15 +1617,19 @@
     <w:name w:val="heading 2"/>
     <w:basedOn w:val="Normal"/>
     <w:next w:val="Normal"/>
+    <w:uiPriority w:val="9"/>
+    <w:unhideWhenUsed/>
+    <w:qFormat/>
     <w:pPr>
-      <w:keepNext w:val="1"/>
-      <w:keepLines w:val="1"/>
-      <w:spacing w:before="480" w:lineRule="auto"/>
+      <w:keepNext/>
+      <w:keepLines/>
+      <w:spacing w:before="480"/>
+      <w:outlineLvl w:val="1"/>
     </w:pPr>
     <w:rPr>
-      <w:rFonts w:ascii="Arial" w:cs="Arial" w:eastAsia="Arial" w:hAnsi="Arial"/>
-      <w:b w:val="1"/>
-      <w:bCs w:val="1"/>
+      <w:rFonts w:ascii="Arial" w:eastAsia="Arial" w:hAnsi="Arial" w:cs="Arial"/>
+      <w:b/>
+      <w:bCs/>
       <w:color w:val="611940"/>
       <w:sz w:val="36"/>
       <w:szCs w:val="36"/>
@@ -1327,13 +1639,17 @@
     <w:name w:val="heading 3"/>
     <w:basedOn w:val="Normal"/>
     <w:next w:val="Normal"/>
+    <w:uiPriority w:val="9"/>
+    <w:semiHidden/>
+    <w:unhideWhenUsed/>
+    <w:qFormat/>
     <w:pPr>
-      <w:keepNext w:val="1"/>
-      <w:keepLines w:val="1"/>
-      <w:pageBreakBefore w:val="0"/>
+      <w:keepNext/>
+      <w:keepLines/>
+      <w:outlineLvl w:val="2"/>
     </w:pPr>
     <w:rPr>
-      <w:color w:val="008a05"/>
+      <w:color w:val="008A05"/>
       <w:sz w:val="24"/>
       <w:szCs w:val="24"/>
     </w:rPr>
@@ -1342,17 +1658,19 @@
     <w:name w:val="heading 4"/>
     <w:basedOn w:val="Normal"/>
     <w:next w:val="Normal"/>
+    <w:uiPriority w:val="9"/>
+    <w:semiHidden/>
+    <w:unhideWhenUsed/>
+    <w:qFormat/>
     <w:pPr>
-      <w:keepNext w:val="1"/>
-      <w:keepLines w:val="1"/>
-      <w:pageBreakBefore w:val="0"/>
-      <w:spacing w:after="0" w:before="160" w:lineRule="auto"/>
+      <w:keepNext/>
+      <w:keepLines/>
+      <w:spacing w:before="160"/>
+      <w:outlineLvl w:val="3"/>
     </w:pPr>
     <w:rPr>
-      <w:rFonts w:ascii="Trebuchet MS" w:cs="Trebuchet MS" w:eastAsia="Trebuchet MS" w:hAnsi="Trebuchet MS"/>
+      <w:rFonts w:ascii="Trebuchet MS" w:eastAsia="Trebuchet MS" w:hAnsi="Trebuchet MS" w:cs="Trebuchet MS"/>
       <w:color w:val="666666"/>
-      <w:sz w:val="22"/>
-      <w:szCs w:val="22"/>
       <w:u w:val="single"/>
     </w:rPr>
   </w:style>
@@ -1360,52 +1678,94 @@
     <w:name w:val="heading 5"/>
     <w:basedOn w:val="Normal"/>
     <w:next w:val="Normal"/>
+    <w:uiPriority w:val="9"/>
+    <w:semiHidden/>
+    <w:unhideWhenUsed/>
+    <w:qFormat/>
     <w:pPr>
-      <w:keepNext w:val="1"/>
-      <w:keepLines w:val="1"/>
-      <w:pageBreakBefore w:val="0"/>
-      <w:spacing w:after="0" w:before="160" w:lineRule="auto"/>
+      <w:keepNext/>
+      <w:keepLines/>
+      <w:spacing w:before="160"/>
+      <w:outlineLvl w:val="4"/>
     </w:pPr>
     <w:rPr>
-      <w:rFonts w:ascii="Trebuchet MS" w:cs="Trebuchet MS" w:eastAsia="Trebuchet MS" w:hAnsi="Trebuchet MS"/>
+      <w:rFonts w:ascii="Trebuchet MS" w:eastAsia="Trebuchet MS" w:hAnsi="Trebuchet MS" w:cs="Trebuchet MS"/>
       <w:color w:val="666666"/>
-      <w:sz w:val="22"/>
-      <w:szCs w:val="22"/>
     </w:rPr>
   </w:style>
   <w:style w:type="paragraph" w:styleId="Heading6">
     <w:name w:val="heading 6"/>
     <w:basedOn w:val="Normal"/>
     <w:next w:val="Normal"/>
+    <w:uiPriority w:val="9"/>
+    <w:semiHidden/>
+    <w:unhideWhenUsed/>
+    <w:qFormat/>
     <w:pPr>
-      <w:keepNext w:val="1"/>
-      <w:keepLines w:val="1"/>
-      <w:pageBreakBefore w:val="0"/>
-      <w:spacing w:after="0" w:before="160" w:lineRule="auto"/>
+      <w:keepNext/>
+      <w:keepLines/>
+      <w:spacing w:before="160"/>
+      <w:outlineLvl w:val="5"/>
     </w:pPr>
     <w:rPr>
-      <w:rFonts w:ascii="Trebuchet MS" w:cs="Trebuchet MS" w:eastAsia="Trebuchet MS" w:hAnsi="Trebuchet MS"/>
-      <w:i w:val="1"/>
-      <w:iCs w:val="1"/>
+      <w:rFonts w:ascii="Trebuchet MS" w:eastAsia="Trebuchet MS" w:hAnsi="Trebuchet MS" w:cs="Trebuchet MS"/>
+      <w:i/>
+      <w:iCs/>
       <w:color w:val="666666"/>
-      <w:sz w:val="22"/>
-      <w:szCs w:val="22"/>
     </w:rPr>
+  </w:style>
+  <w:style w:type="character" w:default="1" w:styleId="DefaultParagraphFont">
+    <w:name w:val="Default Paragraph Font"/>
+    <w:uiPriority w:val="1"/>
+    <w:semiHidden/>
+    <w:unhideWhenUsed/>
+  </w:style>
+  <w:style w:type="table" w:default="1" w:styleId="TableNormal">
+    <w:name w:val="Normal Table"/>
+    <w:uiPriority w:val="99"/>
+    <w:semiHidden/>
+    <w:unhideWhenUsed/>
+    <w:tblPr>
+      <w:tblInd w:w="0" w:type="dxa"/>
+      <w:tblCellMar>
+        <w:top w:w="0" w:type="dxa"/>
+        <w:left w:w="108" w:type="dxa"/>
+        <w:bottom w:w="0" w:type="dxa"/>
+        <w:right w:w="108" w:type="dxa"/>
+      </w:tblCellMar>
+    </w:tblPr>
+  </w:style>
+  <w:style w:type="numbering" w:default="1" w:styleId="NoList">
+    <w:name w:val="No List"/>
+    <w:uiPriority w:val="99"/>
+    <w:semiHidden/>
+    <w:unhideWhenUsed/>
+  </w:style>
+  <w:style w:type="table" w:customStyle="1" w:styleId="TableNormal0">
+    <w:name w:val="TableNormal"/>
+    <w:tblPr>
+      <w:tblCellMar>
+        <w:top w:w="100" w:type="dxa"/>
+        <w:left w:w="100" w:type="dxa"/>
+        <w:bottom w:w="100" w:type="dxa"/>
+        <w:right w:w="100" w:type="dxa"/>
+      </w:tblCellMar>
+    </w:tblPr>
   </w:style>
   <w:style w:type="paragraph" w:styleId="Title">
     <w:name w:val="Title"/>
     <w:basedOn w:val="Normal"/>
     <w:next w:val="Normal"/>
+    <w:uiPriority w:val="10"/>
+    <w:qFormat/>
     <w:pPr>
-      <w:keepNext w:val="1"/>
-      <w:keepLines w:val="1"/>
-      <w:pageBreakBefore w:val="0"/>
+      <w:keepNext/>
+      <w:keepLines/>
       <w:spacing w:before="1440" w:line="240" w:lineRule="auto"/>
     </w:pPr>
     <w:rPr>
-      <w:rFonts w:ascii="Proxima Nova" w:cs="Proxima Nova" w:eastAsia="Proxima Nova" w:hAnsi="Proxima Nova"/>
-      <w:b w:val="1"/>
-      <w:bCs w:val="1"/>
+      <w:b/>
+      <w:bCs/>
       <w:color w:val="404040"/>
       <w:sz w:val="96"/>
       <w:szCs w:val="96"/>
@@ -1415,16 +1775,61 @@
     <w:name w:val="Subtitle"/>
     <w:basedOn w:val="Normal"/>
     <w:next w:val="Normal"/>
+    <w:uiPriority w:val="11"/>
+    <w:qFormat/>
     <w:pPr>
-      <w:keepNext w:val="1"/>
-      <w:keepLines w:val="1"/>
-      <w:pageBreakBefore w:val="0"/>
-      <w:spacing w:after="200" w:lineRule="auto"/>
+      <w:keepNext/>
+      <w:keepLines/>
+      <w:spacing w:after="200"/>
     </w:pPr>
     <w:rPr>
       <w:sz w:val="32"/>
       <w:szCs w:val="32"/>
     </w:rPr>
+  </w:style>
+  <w:style w:type="paragraph" w:styleId="Header">
+    <w:name w:val="header"/>
+    <w:basedOn w:val="Normal"/>
+    <w:link w:val="HeaderChar"/>
+    <w:uiPriority w:val="99"/>
+    <w:unhideWhenUsed/>
+    <w:rsid w:val="00267E4D"/>
+    <w:pPr>
+      <w:tabs>
+        <w:tab w:val="center" w:pos="4680"/>
+        <w:tab w:val="right" w:pos="9360"/>
+      </w:tabs>
+      <w:spacing w:before="0" w:line="240" w:lineRule="auto"/>
+    </w:pPr>
+  </w:style>
+  <w:style w:type="character" w:customStyle="1" w:styleId="HeaderChar">
+    <w:name w:val="Header Char"/>
+    <w:basedOn w:val="DefaultParagraphFont"/>
+    <w:link w:val="Header"/>
+    <w:uiPriority w:val="99"/>
+    <w:rsid w:val="00267E4D"/>
+  </w:style>
+  <w:style w:type="paragraph" w:styleId="Footer">
+    <w:name w:val="footer"/>
+    <w:basedOn w:val="Normal"/>
+    <w:link w:val="FooterChar"/>
+    <w:uiPriority w:val="99"/>
+    <w:unhideWhenUsed/>
+    <w:rsid w:val="00267E4D"/>
+    <w:pPr>
+      <w:tabs>
+        <w:tab w:val="center" w:pos="4680"/>
+        <w:tab w:val="right" w:pos="9360"/>
+      </w:tabs>
+      <w:spacing w:before="0" w:line="240" w:lineRule="auto"/>
+    </w:pPr>
+  </w:style>
+  <w:style w:type="character" w:customStyle="1" w:styleId="FooterChar">
+    <w:name w:val="Footer Char"/>
+    <w:basedOn w:val="DefaultParagraphFont"/>
+    <w:link w:val="Footer"/>
+    <w:uiPriority w:val="99"/>
+    <w:rsid w:val="00267E4D"/>
   </w:style>
 </w:styles>
 </file>

</xml_diff>